<commit_message>
docs: add the DFD/ERD diagram set and refresh the user manual
The diagrams (drawio sources, mermaid, PNG previews and READMEs for
levels 0 through 3) were produced on 2026-07-27 but never committed,
even though docs/ is a tracked folder. Adds them alongside the updated
HR-GA-E-Memo-User-Manual.docx.

Co-Authored-By: Claude Opus 5 <noreply@anthropic.com>
</commit_message>
<xml_diff>
--- a/HR-GA-E-Memo-User-Manual.docx
+++ b/HR-GA-E-Memo-User-Manual.docx
@@ -6,9 +6,6 @@
       <w:pPr>
         <w:spacing w:before="1200" w:after="120"/>
         <w:jc w:val="center"/>
-        <w:rPr>
-          <w:rFonts w:hint="eastAsia"/>
-        </w:rPr>
       </w:pPr>
       <w:r>
         <w:rPr>
@@ -16,16 +13,13 @@
           <w:color w:val="2563EB"/>
           <w:sz w:val="20"/>
         </w:rPr>
-        <w:t>IT RANGER · COMPLETE AUTO RUBBER MANUFACTURING</w:t>
+        <w:t xml:space="preserve"> COMPLETE AUTO RUBBER MANUFACTURING</w:t>
       </w:r>
     </w:p>
     <w:p>
       <w:pPr>
         <w:spacing w:after="40"/>
         <w:jc w:val="center"/>
-        <w:rPr>
-          <w:rFonts w:hint="eastAsia"/>
-        </w:rPr>
       </w:pPr>
       <w:r>
         <w:rPr>
@@ -40,9 +34,6 @@
       <w:pPr>
         <w:spacing w:after="400"/>
         <w:jc w:val="center"/>
-        <w:rPr>
-          <w:rFonts w:hint="eastAsia"/>
-        </w:rPr>
       </w:pPr>
       <w:r>
         <w:rPr>
@@ -50,30 +41,20 @@
           <w:color w:val="2563EB"/>
           <w:sz w:val="68"/>
         </w:rPr>
-        <w:t>HR&amp;GA E-Memo</w:t>
+        <w:t>E-Memo</w:t>
       </w:r>
     </w:p>
     <w:p>
       <w:pPr>
         <w:spacing w:after="720"/>
         <w:jc w:val="center"/>
-        <w:rPr>
-          <w:rFonts w:hint="eastAsia"/>
-        </w:rPr>
       </w:pPr>
       <w:r>
         <w:rPr>
           <w:color w:val="475569"/>
           <w:sz w:val="23"/>
         </w:rPr>
-        <w:t xml:space="preserve">ระบบร่างเมโมและอนุมัติออนไลน์ของ Complete Auto Rubber Manufacturing — ตั้งแต่สร้างเอกสาร ส่งอนุมัติตามสายบังคับบัญชา </w:t>
-      </w:r>
-      <w:r>
-        <w:rPr>
-          <w:color w:val="475569"/>
-          <w:sz w:val="23"/>
-        </w:rPr>
-        <w:t>ไปจนถึงติดตามผลและแจ้งเตือนผ่าน Telegram</w:t>
+        <w:t>ระบบร่างเมโมและอนุมัติออนไลน์ของ Complete Auto Rubber Manufacturing — ตั้งแต่สร้างเอกสาร ส่งอนุมัติตามสายบังคับบัญชา ไปจนถึงติดตามผลและแจ้งเตือนผ่าน Telegram</w:t>
       </w:r>
     </w:p>
     <w:tbl>
@@ -102,9 +83,6 @@
             <w:pPr>
               <w:spacing w:before="80" w:after="80"/>
               <w:jc w:val="center"/>
-              <w:rPr>
-                <w:rFonts w:hint="eastAsia"/>
-              </w:rPr>
             </w:pPr>
             <w:r>
               <w:rPr>
@@ -126,9 +104,6 @@
             <w:pPr>
               <w:spacing w:before="80" w:after="80"/>
               <w:jc w:val="center"/>
-              <w:rPr>
-                <w:rFonts w:hint="eastAsia"/>
-              </w:rPr>
             </w:pPr>
             <w:r>
               <w:rPr>
@@ -150,9 +125,6 @@
             <w:pPr>
               <w:spacing w:before="80" w:after="80"/>
               <w:jc w:val="center"/>
-              <w:rPr>
-                <w:rFonts w:hint="eastAsia"/>
-              </w:rPr>
             </w:pPr>
             <w:r>
               <w:rPr>
@@ -179,9 +151,6 @@
             <w:pPr>
               <w:spacing w:before="80" w:after="80"/>
               <w:jc w:val="center"/>
-              <w:rPr>
-                <w:rFonts w:hint="eastAsia"/>
-              </w:rPr>
             </w:pPr>
             <w:r>
               <w:rPr>
@@ -189,15 +158,7 @@
                 <w:color w:val="0B142C"/>
                 <w:sz w:val="21"/>
               </w:rPr>
-              <w:t xml:space="preserve">6 </w:t>
-            </w:r>
-            <w:r>
-              <w:rPr>
-                <w:b/>
-                <w:color w:val="0B142C"/>
-                <w:sz w:val="21"/>
-              </w:rPr>
-              <w:t>กรกฎาคม 2569</w:t>
+              <w:t>6 กรกฎาคม 2569</w:t>
             </w:r>
           </w:p>
         </w:tc>
@@ -211,9 +172,6 @@
             <w:pPr>
               <w:spacing w:before="80" w:after="80"/>
               <w:jc w:val="center"/>
-              <w:rPr>
-                <w:rFonts w:hint="eastAsia"/>
-              </w:rPr>
             </w:pPr>
             <w:r>
               <w:rPr>
@@ -236,7 +194,7 @@
               <w:spacing w:before="80" w:after="80"/>
               <w:jc w:val="center"/>
               <w:rPr>
-                <w:rFonts w:hint="eastAsia"/>
+                <w:lang w:bidi="th-TH"/>
               </w:rPr>
             </w:pPr>
             <w:r>
@@ -244,8 +202,9 @@
                 <w:b/>
                 <w:color w:val="0B142C"/>
                 <w:sz w:val="21"/>
+                <w:lang w:bidi="th-TH"/>
               </w:rPr>
-              <w:t>ทีม IT Ranger</w:t>
+              <w:t>Punnawich</w:t>
             </w:r>
           </w:p>
         </w:tc>
@@ -255,9 +214,6 @@
       <w:pPr>
         <w:keepNext/>
         <w:pageBreakBefore/>
-        <w:rPr>
-          <w:rFonts w:hint="eastAsia"/>
-        </w:rPr>
       </w:pPr>
       <w:r>
         <w:rPr>
@@ -272,230 +228,146 @@
     <w:p>
       <w:pPr>
         <w:spacing w:after="80"/>
-        <w:rPr>
-          <w:rFonts w:hint="eastAsia"/>
-        </w:rPr>
       </w:pPr>
       <w:r>
         <w:rPr>
           <w:color w:val="0B142C"/>
           <w:sz w:val="23"/>
         </w:rPr>
-        <w:t xml:space="preserve">1. </w:t>
-      </w:r>
+        <w:t>1. เข้าสู่ระบบ</w:t>
+      </w:r>
+    </w:p>
+    <w:p>
+      <w:pPr>
+        <w:spacing w:after="80"/>
+      </w:pPr>
       <w:r>
         <w:rPr>
           <w:color w:val="0B142C"/>
           <w:sz w:val="23"/>
         </w:rPr>
-        <w:t>เข้าสู่ระบบ</w:t>
+        <w:t>2. หน้า Dashboard</w:t>
       </w:r>
     </w:p>
     <w:p>
       <w:pPr>
         <w:spacing w:after="80"/>
-        <w:rPr>
-          <w:rFonts w:hint="eastAsia"/>
-        </w:rPr>
       </w:pPr>
       <w:r>
         <w:rPr>
           <w:color w:val="0B142C"/>
           <w:sz w:val="23"/>
         </w:rPr>
-        <w:t xml:space="preserve">2. </w:t>
-      </w:r>
+        <w:t>3. สร้างและส่งเมโม</w:t>
+      </w:r>
+    </w:p>
+    <w:p>
+      <w:pPr>
+        <w:spacing w:after="80"/>
+      </w:pPr>
       <w:r>
         <w:rPr>
           <w:color w:val="0B142C"/>
           <w:sz w:val="23"/>
         </w:rPr>
-        <w:t>หน้า Dashboard</w:t>
+        <w:t xml:space="preserve">     3.1 กติกา MD Review</w:t>
       </w:r>
     </w:p>
     <w:p>
       <w:pPr>
         <w:spacing w:after="80"/>
-        <w:rPr>
-          <w:rFonts w:hint="eastAsia"/>
-        </w:rPr>
       </w:pPr>
       <w:r>
         <w:rPr>
           <w:color w:val="0B142C"/>
           <w:sz w:val="23"/>
         </w:rPr>
-        <w:t xml:space="preserve">3. </w:t>
-      </w:r>
+        <w:t xml:space="preserve">     3.2 เส้นทางอนุมัติ (Approver Routing)</w:t>
+      </w:r>
+    </w:p>
+    <w:p>
+      <w:pPr>
+        <w:spacing w:after="80"/>
+      </w:pPr>
       <w:r>
         <w:rPr>
           <w:color w:val="0B142C"/>
           <w:sz w:val="23"/>
         </w:rPr>
-        <w:t>สร้างและส่งเมโม</w:t>
+        <w:t xml:space="preserve">     3.3 </w:t>
+      </w:r>
+      <w:r>
+        <w:rPr>
+          <w:color w:val="0B142C"/>
+          <w:sz w:val="23"/>
+        </w:rPr>
+        <w:t>ใช้แม่แบบ (Template)</w:t>
       </w:r>
     </w:p>
     <w:p>
       <w:pPr>
         <w:spacing w:after="80"/>
-        <w:rPr>
-          <w:rFonts w:hint="eastAsia"/>
-        </w:rPr>
       </w:pPr>
       <w:r>
         <w:rPr>
           <w:color w:val="0B142C"/>
           <w:sz w:val="23"/>
         </w:rPr>
-        <w:t xml:space="preserve">     3.1 </w:t>
-      </w:r>
+        <w:t>4. Approval Queue — ติดตามสถานะ</w:t>
+      </w:r>
+    </w:p>
+    <w:p>
+      <w:pPr>
+        <w:spacing w:after="80"/>
+      </w:pPr>
       <w:r>
         <w:rPr>
           <w:color w:val="0B142C"/>
           <w:sz w:val="23"/>
         </w:rPr>
-        <w:t>กติกา MD Review</w:t>
+        <w:t>5. สำหรับผู้อนุมัติ (Manager / GM / MD)</w:t>
       </w:r>
     </w:p>
     <w:p>
       <w:pPr>
         <w:spacing w:after="80"/>
-        <w:rPr>
-          <w:rFonts w:hint="eastAsia"/>
-        </w:rPr>
       </w:pPr>
       <w:r>
         <w:rPr>
           <w:color w:val="0B142C"/>
           <w:sz w:val="23"/>
         </w:rPr>
-        <w:t xml:space="preserve">     3.2 </w:t>
-      </w:r>
+        <w:t>6. ประวัติเอกสารและรายงาน</w:t>
+      </w:r>
+    </w:p>
+    <w:p>
+      <w:pPr>
+        <w:spacing w:after="80"/>
+      </w:pPr>
       <w:r>
         <w:rPr>
           <w:color w:val="0B142C"/>
           <w:sz w:val="23"/>
         </w:rPr>
-        <w:t>เส้นทางอนุมัติ (Approver Routing)</w:t>
+        <w:t>7. การแจ้งเตือน &amp; Telegram</w:t>
       </w:r>
     </w:p>
     <w:p>
       <w:pPr>
         <w:spacing w:after="80"/>
-        <w:rPr>
-          <w:rFonts w:hint="eastAsia"/>
-        </w:rPr>
       </w:pPr>
       <w:r>
         <w:rPr>
           <w:color w:val="0B142C"/>
           <w:sz w:val="23"/>
         </w:rPr>
-        <w:t xml:space="preserve">4. Approval Queue — </w:t>
-      </w:r>
-      <w:r>
-        <w:rPr>
-          <w:color w:val="0B142C"/>
-          <w:sz w:val="23"/>
-        </w:rPr>
-        <w:t>ติดตามสถานะ</w:t>
+        <w:t>8. โปรไฟล์ของฉัน</w:t>
       </w:r>
     </w:p>
     <w:p>
       <w:pPr>
-        <w:spacing w:after="80"/>
-        <w:rPr>
-          <w:rFonts w:hint="eastAsia"/>
-        </w:rPr>
-      </w:pPr>
-      <w:r>
-        <w:rPr>
-          <w:color w:val="0B142C"/>
-          <w:sz w:val="23"/>
-        </w:rPr>
-        <w:t xml:space="preserve">5. </w:t>
-      </w:r>
-      <w:r>
-        <w:rPr>
-          <w:color w:val="0B142C"/>
-          <w:sz w:val="23"/>
-        </w:rPr>
-        <w:t>สำหรับผู้อนุมัติ (Manager / GM / MD)</w:t>
-      </w:r>
-    </w:p>
-    <w:p>
-      <w:pPr>
-        <w:spacing w:after="80"/>
-        <w:rPr>
-          <w:rFonts w:hint="eastAsia"/>
-        </w:rPr>
-      </w:pPr>
-      <w:r>
-        <w:rPr>
-          <w:color w:val="0B142C"/>
-          <w:sz w:val="23"/>
-        </w:rPr>
-        <w:t xml:space="preserve">6. </w:t>
-      </w:r>
-      <w:r>
-        <w:rPr>
-          <w:color w:val="0B142C"/>
-          <w:sz w:val="23"/>
-        </w:rPr>
-        <w:t>ประวัติเอกสารและรายงาน</w:t>
-      </w:r>
-    </w:p>
-    <w:p>
-      <w:pPr>
-        <w:spacing w:after="80"/>
-        <w:rPr>
-          <w:rFonts w:hint="eastAsia"/>
-        </w:rPr>
-      </w:pPr>
-      <w:r>
-        <w:rPr>
-          <w:color w:val="0B142C"/>
-          <w:sz w:val="23"/>
-        </w:rPr>
-        <w:t xml:space="preserve">7. </w:t>
-      </w:r>
-      <w:r>
-        <w:rPr>
-          <w:color w:val="0B142C"/>
-          <w:sz w:val="23"/>
-        </w:rPr>
-        <w:t>การแจ้งเตือน &amp; Telegram</w:t>
-      </w:r>
-    </w:p>
-    <w:p>
-      <w:pPr>
-        <w:spacing w:after="80"/>
-        <w:rPr>
-          <w:rFonts w:hint="eastAsia"/>
-        </w:rPr>
-      </w:pPr>
-      <w:r>
-        <w:rPr>
-          <w:color w:val="0B142C"/>
-          <w:sz w:val="23"/>
-        </w:rPr>
-        <w:t xml:space="preserve">8. </w:t>
-      </w:r>
-      <w:r>
-        <w:rPr>
-          <w:color w:val="0B142C"/>
-          <w:sz w:val="23"/>
-        </w:rPr>
-        <w:t>โปรไฟล์ของฉัน</w:t>
-      </w:r>
-    </w:p>
-    <w:p>
-      <w:pPr>
         <w:keepNext/>
         <w:pageBreakBefore/>
-        <w:rPr>
-          <w:rFonts w:hint="eastAsia"/>
-        </w:rPr>
       </w:pPr>
       <w:r>
         <w:rPr>
@@ -504,44 +376,27 @@
           <w:sz w:val="40"/>
         </w:rPr>
         <w:lastRenderedPageBreak/>
-        <w:t xml:space="preserve">1. </w:t>
-      </w:r>
-      <w:r>
-        <w:rPr>
-          <w:b/>
-          <w:color w:val="0B142C"/>
-          <w:sz w:val="40"/>
-        </w:rPr>
-        <w:t>เข้าสู่ระบบ</w:t>
+        <w:t>1. เข้าสู่ระบบ</w:t>
       </w:r>
     </w:p>
     <w:p>
       <w:pPr>
         <w:spacing w:after="120"/>
-        <w:rPr>
-          <w:rFonts w:hint="eastAsia"/>
-        </w:rPr>
-      </w:pPr>
-      <w:r>
-        <w:t>เข้าใช้งานด้วยอีเมลบริษัทของคุณ (@car-1996.com) และรหัสผ</w:t>
-      </w:r>
-      <w:r>
-        <w:t>่านที่ตั้งไว้ตอนลงทะเบียน เปิดใช้ได้จากทุกที่ผ่านเบราว์เซอร์ เพียงพิมพ์ memo.car-1996.com</w:t>
+      </w:pPr>
+      <w:r>
+        <w:t>เข้าใช้งานด้วยอีเมลบริษัทของคุณ (@car-1996.com) และรหัสผ่านที่ตั้งไว้ตอนลงทะเบียน เปิดใช้ได้จากทุกที่ผ่านเบราว์เซอร์ เพียงพิมพ์ memo.car-1996.com</w:t>
       </w:r>
     </w:p>
     <w:p>
       <w:pPr>
         <w:jc w:val="center"/>
-        <w:rPr>
-          <w:rFonts w:hint="eastAsia"/>
-        </w:rPr>
       </w:pPr>
       <w:r>
         <w:rPr>
           <w:noProof/>
         </w:rPr>
         <w:drawing>
-          <wp:inline distT="0" distB="0" distL="0" distR="0" wp14:anchorId="3EF4C840" wp14:editId="4FB311AC">
+          <wp:inline distT="0" distB="0" distL="0" distR="0" wp14:anchorId="0787E98F" wp14:editId="0417CF45">
             <wp:extent cx="5760720" cy="3600450"/>
             <wp:effectExtent l="0" t="0" r="0" b="0"/>
             <wp:docPr id="1" name="Picture 1"/>
@@ -581,9 +436,6 @@
       <w:pPr>
         <w:spacing w:after="280"/>
         <w:jc w:val="center"/>
-        <w:rPr>
-          <w:rFonts w:hint="eastAsia"/>
-        </w:rPr>
       </w:pPr>
       <w:r>
         <w:rPr>
@@ -598,9 +450,6 @@
       <w:pPr>
         <w:pStyle w:val="ListBullet"/>
         <w:spacing w:after="80"/>
-        <w:rPr>
-          <w:rFonts w:hint="eastAsia"/>
-        </w:rPr>
       </w:pPr>
       <w:r>
         <w:rPr>
@@ -613,22 +462,13 @@
         <w:rPr>
           <w:sz w:val="21"/>
         </w:rPr>
-        <w:t xml:space="preserve"> </w:t>
-      </w:r>
-      <w:r>
-        <w:rPr>
-          <w:sz w:val="21"/>
-        </w:rPr>
-        <w:t>ใช้อีเมลบริษัทเท่านั้น เช่น name@car-1996.com อีเมลส่วนตัวใช้ไม่ได้</w:t>
+        <w:t xml:space="preserve"> ใช้อีเมลบริษัทเท่านั้น เช่น name@car-1996.com อีเมลส่วนตัวใช้ไม่ได้</w:t>
       </w:r>
     </w:p>
     <w:p>
       <w:pPr>
         <w:pStyle w:val="ListBullet"/>
         <w:spacing w:after="80"/>
-        <w:rPr>
-          <w:rFonts w:hint="eastAsia"/>
-        </w:rPr>
       </w:pPr>
       <w:r>
         <w:rPr>
@@ -641,22 +481,13 @@
         <w:rPr>
           <w:sz w:val="21"/>
         </w:rPr>
-        <w:t xml:space="preserve"> </w:t>
-      </w:r>
-      <w:r>
-        <w:rPr>
-          <w:sz w:val="21"/>
-        </w:rPr>
-        <w:t>พิมพ์รหัสผ่าน แล้วกดไอคอนรูปตาถ้าอยากเช็กว่าพิมพ์ถูกไหมก่อนกดเข้าสู่ระบบ</w:t>
+        <w:t xml:space="preserve"> พิมพ์รหัสผ่าน แล้วกดไอคอนรูปตาถ้าอยากเช็กว่าพิมพ์ถูกไหมก่อนกดเข้าสู่ระบบ</w:t>
       </w:r>
     </w:p>
     <w:p>
       <w:pPr>
         <w:pStyle w:val="ListBullet"/>
         <w:spacing w:after="80"/>
-        <w:rPr>
-          <w:rFonts w:hint="eastAsia"/>
-        </w:rPr>
       </w:pPr>
       <w:r>
         <w:rPr>
@@ -669,92 +500,51 @@
         <w:rPr>
           <w:sz w:val="21"/>
         </w:rPr>
-        <w:t xml:space="preserve"> </w:t>
-      </w:r>
-      <w:r>
-        <w:rPr>
-          <w:sz w:val="21"/>
-        </w:rPr>
-        <w:t>คลิกลิงก์นี้เพื่อขอลิงก์ตั้งรหัสผ่านใหม่ ระบบจะส่งให้ทางอีเมลบริษัทของคุณ</w:t>
+        <w:t xml:space="preserve"> คลิกลิงก์นี้เพื่อขอลิงก์ตั้งรหัสผ่านใหม่ ระบบจะส่งให้ทางอีเมลบริษัทของคุณ</w:t>
       </w:r>
     </w:p>
     <w:p>
       <w:pPr>
         <w:pStyle w:val="ListBullet"/>
         <w:spacing w:after="80"/>
-        <w:rPr>
-          <w:rFonts w:hint="eastAsia"/>
-        </w:rPr>
       </w:pPr>
       <w:r>
         <w:rPr>
           <w:b/>
           <w:sz w:val="21"/>
         </w:rPr>
-        <w:t>ยังไม่มีบัญชี?</w:t>
-      </w:r>
+        <w:t>ยังไม่มีบัญชี? ลงทะเบียน —</w:t>
+      </w:r>
+      <w:r>
+        <w:rPr>
+          <w:sz w:val="21"/>
+        </w:rPr>
+        <w:t xml:space="preserve"> กรอกเลขบัตรพนักงานเพื่อสมัคร แล้วรอแอดมินอนุมัติสิทธิ์ให้ก่อนจึงจะเข้าใช้งานได้</w:t>
+      </w:r>
+    </w:p>
+    <w:p>
+      <w:pPr>
+        <w:pStyle w:val="ListBullet"/>
+        <w:spacing w:after="80"/>
+      </w:pPr>
       <w:r>
         <w:rPr>
           <w:b/>
           <w:sz w:val="21"/>
         </w:rPr>
-        <w:t xml:space="preserve"> </w:t>
-      </w:r>
-      <w:r>
-        <w:rPr>
-          <w:b/>
+        <w:t>หมายเหตุ —</w:t>
+      </w:r>
+      <w:r>
+        <w:rPr>
           <w:sz w:val="21"/>
         </w:rPr>
-        <w:t>ลงทะเบียน —</w:t>
-      </w:r>
-      <w:r>
-        <w:rPr>
-          <w:sz w:val="21"/>
-        </w:rPr>
-        <w:t xml:space="preserve"> </w:t>
-      </w:r>
-      <w:r>
-        <w:rPr>
-          <w:sz w:val="21"/>
-        </w:rPr>
-        <w:t>กรอกเลขบัตรพนักงานเพื่อสมัคร แล้วรอแอดมินอนุมัติสิทธิ์ให้ก่อนจึงจะเข้าใช้งานได้</w:t>
+        <w:t xml:space="preserve"> สังเกตลิงก์ "ใช้งานครั้งแรก? ดูคู่มือการใช้งานระบบ" ใต้กล่อง login — เปิดคู่มือฉบับในระบบได้โดยไม่ต้องล็อกอิน</w:t>
       </w:r>
     </w:p>
     <w:p>
       <w:pPr>
-        <w:pStyle w:val="ListBullet"/>
-        <w:spacing w:after="80"/>
-        <w:rPr>
-          <w:rFonts w:hint="eastAsia"/>
-        </w:rPr>
-      </w:pPr>
-      <w:r>
-        <w:rPr>
-          <w:b/>
-          <w:sz w:val="21"/>
-        </w:rPr>
-        <w:t>หมายเหตุ —</w:t>
-      </w:r>
-      <w:r>
-        <w:rPr>
-          <w:sz w:val="21"/>
-        </w:rPr>
-        <w:t xml:space="preserve"> </w:t>
-      </w:r>
-      <w:r>
-        <w:rPr>
-          <w:sz w:val="21"/>
-        </w:rPr>
-        <w:t>สังเกตลิงก์ "ใช้งานครั้งแรก? ดูคู่มือการใช้งานระบบ" ใต้กล่อง login — เปิดคู่มือฉบับในระบบได้โดยไม่ต้องล็อกอิน</w:t>
-      </w:r>
-    </w:p>
-    <w:p>
-      <w:pPr>
         <w:keepNext/>
         <w:pageBreakBefore/>
-        <w:rPr>
-          <w:rFonts w:hint="eastAsia"/>
-        </w:rPr>
       </w:pPr>
       <w:r>
         <w:rPr>
@@ -763,44 +553,27 @@
           <w:sz w:val="40"/>
         </w:rPr>
         <w:lastRenderedPageBreak/>
-        <w:t xml:space="preserve">2. </w:t>
-      </w:r>
-      <w:r>
-        <w:rPr>
-          <w:b/>
-          <w:color w:val="0B142C"/>
-          <w:sz w:val="40"/>
-        </w:rPr>
-        <w:t>หน้า Dashboard</w:t>
+        <w:t>2. หน้า Dashboard</w:t>
       </w:r>
     </w:p>
     <w:p>
       <w:pPr>
         <w:spacing w:after="120"/>
-        <w:rPr>
-          <w:rFonts w:hint="eastAsia"/>
-        </w:rPr>
-      </w:pPr>
-      <w:r>
-        <w:t>หน้าแรกที่คุณจะเห็นทันที</w:t>
-      </w:r>
-      <w:r>
-        <w:t>หลังเข้าสู่ระบบ สรุปให้เห็นภาพรวมว่ามีงานอะไรรอคุณอยู่บ้าง และผลงานอนุมัติที่ผ่านมาเป็นอย่างไร</w:t>
+      </w:pPr>
+      <w:r>
+        <w:t>หน้าแรกที่คุณจะเห็นทันทีหลังเข้าสู่ระบบ สรุปให้เห็นภาพรวมว่ามีงานอะไรรอคุณอยู่บ้าง และผลงานอนุมัติที่ผ่านมาเป็นอย่างไร</w:t>
       </w:r>
     </w:p>
     <w:p>
       <w:pPr>
         <w:jc w:val="center"/>
-        <w:rPr>
-          <w:rFonts w:hint="eastAsia"/>
-        </w:rPr>
       </w:pPr>
       <w:r>
         <w:rPr>
           <w:noProof/>
         </w:rPr>
         <w:drawing>
-          <wp:inline distT="0" distB="0" distL="0" distR="0" wp14:anchorId="23B9C5D5" wp14:editId="28E747C2">
+          <wp:inline distT="0" distB="0" distL="0" distR="0" wp14:anchorId="20774603" wp14:editId="1AC5A08F">
             <wp:extent cx="5760720" cy="3600450"/>
             <wp:effectExtent l="0" t="0" r="0" b="0"/>
             <wp:docPr id="2" name="Picture 2"/>
@@ -840,9 +613,6 @@
       <w:pPr>
         <w:spacing w:after="280"/>
         <w:jc w:val="center"/>
-        <w:rPr>
-          <w:rFonts w:hint="eastAsia"/>
-        </w:rPr>
       </w:pPr>
       <w:r>
         <w:rPr>
@@ -857,9 +627,6 @@
       <w:pPr>
         <w:pStyle w:val="ListBullet"/>
         <w:spacing w:after="80"/>
-        <w:rPr>
-          <w:rFonts w:hint="eastAsia"/>
-        </w:rPr>
       </w:pPr>
       <w:r>
         <w:rPr>
@@ -872,34 +639,13 @@
         <w:rPr>
           <w:sz w:val="21"/>
         </w:rPr>
-        <w:t xml:space="preserve"> </w:t>
-      </w:r>
-      <w:r>
-        <w:rPr>
-          <w:sz w:val="21"/>
-        </w:rPr>
-        <w:t>ทักทายคุณตามช่วงเวลาจริง พร้อมบอกจำนวนเอกสารที่กำลังรอให้คุณอนุมัติ กดปุ่ม "Review Qu</w:t>
-      </w:r>
-      <w:r>
-        <w:rPr>
-          <w:sz w:val="21"/>
-        </w:rPr>
-        <w:t xml:space="preserve">eue" </w:t>
-      </w:r>
-      <w:r>
-        <w:rPr>
-          <w:sz w:val="21"/>
-        </w:rPr>
-        <w:t>เพื่อไปดูรายการได้ทันที</w:t>
+        <w:t xml:space="preserve"> ทักทายคุณตามช่วงเวลาจริง พร้อมบอกจำนวนเอกสารที่กำลังรอให้คุณอนุมัติ กดปุ่ม "Review Queue" เพื่อไปดูรายการได้ทันที</w:t>
       </w:r>
     </w:p>
     <w:p>
       <w:pPr>
         <w:pStyle w:val="ListBullet"/>
         <w:spacing w:after="80"/>
-        <w:rPr>
-          <w:rFonts w:hint="eastAsia"/>
-        </w:rPr>
       </w:pPr>
       <w:r>
         <w:rPr>
@@ -912,22 +658,13 @@
         <w:rPr>
           <w:sz w:val="21"/>
         </w:rPr>
-        <w:t xml:space="preserve"> </w:t>
-      </w:r>
-      <w:r>
-        <w:rPr>
-          <w:sz w:val="21"/>
-        </w:rPr>
-        <w:t>จำนวนเมโมทั้งหมด, ที่ยังรออนุมัติ, ที่อนุมัติแล้ว และเวลาเฉลี่ยที่ใช้ต่อฉบับ พร้อมเทียบให้เห็นว่าดีขึ้นหรือแย่ลงจากสัปดาห์ก่อน</w:t>
+        <w:t xml:space="preserve"> จำนวนเมโมทั้งหมด, ที่ยังรออนุมัติ, ที่อนุมัติแล้ว และเวลาเฉลี่ยที่ใช้ต่อฉบับ พร้อมเทียบให้เห็นว่าดีขึ้นหรือแย่ลงจากสัปดาห์ก่อน</w:t>
       </w:r>
     </w:p>
     <w:p>
       <w:pPr>
         <w:pStyle w:val="ListBullet"/>
         <w:spacing w:after="80"/>
-        <w:rPr>
-          <w:rFonts w:hint="eastAsia"/>
-        </w:rPr>
       </w:pPr>
       <w:r>
         <w:rPr>
@@ -940,22 +677,13 @@
         <w:rPr>
           <w:sz w:val="21"/>
         </w:rPr>
-        <w:t xml:space="preserve"> </w:t>
-      </w:r>
-      <w:r>
-        <w:rPr>
-          <w:sz w:val="21"/>
-        </w:rPr>
-        <w:t>สรุปให้ว่าแต่ละระดับผู้อนุมัติ (Manager / GM / MD) ใช้เวลาพิจารณาโดยเฉลี่ยเท่าไหร่ ช่วยให้เห็นว่าฉบับไหนค้างนานเกินเกณฑ์</w:t>
+        <w:t xml:space="preserve"> สรุปให้ว่าแต่ละระดับผู้อนุมัติ (Manager / GM / MD) ใช้เวลาพิจารณาโดยเฉลี่ยเท่าไหร่ ช่วยให้เห็นว่าฉบับไหนค้างนานเกินเกณฑ์</w:t>
       </w:r>
     </w:p>
     <w:p>
       <w:pPr>
         <w:pStyle w:val="ListBullet"/>
         <w:spacing w:after="80"/>
-        <w:rPr>
-          <w:rFonts w:hint="eastAsia"/>
-        </w:rPr>
       </w:pPr>
       <w:r>
         <w:rPr>
@@ -968,22 +696,13 @@
         <w:rPr>
           <w:sz w:val="21"/>
         </w:rPr>
-        <w:t xml:space="preserve"> </w:t>
-      </w:r>
-      <w:r>
-        <w:rPr>
-          <w:sz w:val="21"/>
-        </w:rPr>
-        <w:t>รายการเหตุการณ์ล่าสุดที่เกี่ยวข้องกับคุณ เรียงตามเวลาที่เกิดขึ้นจริง</w:t>
+        <w:t xml:space="preserve"> รายการเหตุการณ์ล่าสุดที่เกี่ยวข้องกับคุณ เรียงตามเวลาที่เกิดขึ้นจริง</w:t>
       </w:r>
     </w:p>
     <w:p>
       <w:pPr>
         <w:keepNext/>
         <w:pageBreakBefore/>
-        <w:rPr>
-          <w:rFonts w:hint="eastAsia"/>
-        </w:rPr>
       </w:pPr>
       <w:r>
         <w:rPr>
@@ -992,44 +711,27 @@
           <w:sz w:val="40"/>
         </w:rPr>
         <w:lastRenderedPageBreak/>
-        <w:t xml:space="preserve">3. </w:t>
-      </w:r>
-      <w:r>
-        <w:rPr>
-          <w:b/>
-          <w:color w:val="0B142C"/>
-          <w:sz w:val="40"/>
-        </w:rPr>
-        <w:t>สร้างและส่งเมโม</w:t>
+        <w:t>3. สร้างและส่งเมโม</w:t>
       </w:r>
     </w:p>
     <w:p>
       <w:pPr>
         <w:spacing w:after="120"/>
-        <w:rPr>
-          <w:rFonts w:hint="eastAsia"/>
-        </w:rPr>
-      </w:pPr>
-      <w:r>
-        <w:t xml:space="preserve">คลิก Create Memo ในเมนูซ้าย </w:t>
-      </w:r>
-      <w:r>
-        <w:t>หรือปุ่ม + New Memo ที่มุมขวาบน (กดได้จากทุกหน้า) ฟอร์มทั้งหมดแบ่งเป็น 3 ขั้นตอนต่อเนื่อง ทำในหน้าเดียวจบ ไม่ต้องสลับหน้าไปมา</w:t>
+      </w:pPr>
+      <w:r>
+        <w:t>คลิก Create Memo ในเมนูซ้าย หรือปุ่ม + New Memo ที่มุมขวาบน (กดได้จากทุกหน้า) ฟอร์มทั้งหมดแบ่งเป็น 3 ขั้นตอนต่อเนื่อง ทำในหน้าเดียวจบ ไม่ต้องสลับหน้าไปมา</w:t>
       </w:r>
     </w:p>
     <w:p>
       <w:pPr>
         <w:jc w:val="center"/>
-        <w:rPr>
-          <w:rFonts w:hint="eastAsia"/>
-        </w:rPr>
       </w:pPr>
       <w:r>
         <w:rPr>
           <w:noProof/>
         </w:rPr>
         <w:drawing>
-          <wp:inline distT="0" distB="0" distL="0" distR="0" wp14:anchorId="4BB8ACFA" wp14:editId="06D0C1F3">
+          <wp:inline distT="0" distB="0" distL="0" distR="0" wp14:anchorId="2AAD3BA8" wp14:editId="52D66E3A">
             <wp:extent cx="5760720" cy="3600450"/>
             <wp:effectExtent l="0" t="0" r="0" b="0"/>
             <wp:docPr id="3" name="Picture 3"/>
@@ -1069,9 +771,6 @@
       <w:pPr>
         <w:spacing w:after="280"/>
         <w:jc w:val="center"/>
-        <w:rPr>
-          <w:rFonts w:hint="eastAsia"/>
-        </w:rPr>
       </w:pPr>
       <w:r>
         <w:rPr>
@@ -1086,9 +785,6 @@
       <w:pPr>
         <w:pStyle w:val="ListBullet"/>
         <w:spacing w:after="80"/>
-        <w:rPr>
-          <w:rFonts w:hint="eastAsia"/>
-        </w:rPr>
       </w:pPr>
       <w:r>
         <w:rPr>
@@ -1101,34 +797,13 @@
         <w:rPr>
           <w:sz w:val="21"/>
         </w:rPr>
-        <w:t xml:space="preserve"> </w:t>
-      </w:r>
-      <w:r>
-        <w:rPr>
-          <w:sz w:val="21"/>
-        </w:rPr>
-        <w:t>กรอกเรื่องที่ขอ</w:t>
-      </w:r>
-      <w:r>
-        <w:rPr>
-          <w:sz w:val="21"/>
-        </w:rPr>
-        <w:t xml:space="preserve"> </w:t>
-      </w:r>
-      <w:r>
-        <w:rPr>
-          <w:sz w:val="21"/>
-        </w:rPr>
-        <w:t>หมวดรายการ แผนก และจำนวนเงินให้ครบ ส่วนเลขที่เอกสาร ชื่อผู้จัดทำ และเวลา ระบบจะจัดการให้อัตโนมัติ</w:t>
+        <w:t xml:space="preserve"> กรอกเรื่องที่ขอ หมวดรายการ แผนก และจำนวนเงินให้ครบ ส่วนเลขที่เอกสาร ชื่อผู้จัดทำ และเวลา ระบบจะจัดการให้อัตโนมัติ</w:t>
       </w:r>
     </w:p>
     <w:p>
       <w:pPr>
         <w:pStyle w:val="ListBullet"/>
         <w:spacing w:after="80"/>
-        <w:rPr>
-          <w:rFonts w:hint="eastAsia"/>
-        </w:rPr>
       </w:pPr>
       <w:r>
         <w:rPr>
@@ -1141,22 +816,13 @@
         <w:rPr>
           <w:sz w:val="21"/>
         </w:rPr>
-        <w:t xml:space="preserve"> </w:t>
-      </w:r>
-      <w:r>
-        <w:rPr>
-          <w:sz w:val="21"/>
-        </w:rPr>
-        <w:t>มีผลต่อสายอนุมัติโดยตรง จึงควรเลือกให้ตรงกับงานจริงเสมอ (วัตถุดิบ / สินทรัพย์ถาวร / การว่าจ้าง-สัญญา / ซื้อทั่วไป / แม่พิมพ์)</w:t>
+        <w:t xml:space="preserve"> มีผลต่อสายอนุมัติโดยตรง จึงควรเลือกให้ตรงกับงานจริงเสมอ (วัตถุดิบ / สินทรัพย์ถาวร / การว่าจ้าง-สัญญา / ซื้อทั่วไป / แม่พิมพ์)</w:t>
       </w:r>
     </w:p>
     <w:p>
       <w:pPr>
         <w:pStyle w:val="ListBullet"/>
         <w:spacing w:after="80"/>
-        <w:rPr>
-          <w:rFonts w:hint="eastAsia"/>
-        </w:rPr>
       </w:pPr>
       <w:r>
         <w:rPr>
@@ -1169,28 +835,13 @@
         <w:rPr>
           <w:sz w:val="21"/>
         </w:rPr>
-        <w:t xml:space="preserve"> </w:t>
-      </w:r>
-      <w:r>
-        <w:rPr>
-          <w:sz w:val="21"/>
-        </w:rPr>
-        <w:t>ถ้ารายก</w:t>
-      </w:r>
-      <w:r>
-        <w:rPr>
-          <w:sz w:val="21"/>
-        </w:rPr>
-        <w:t>ารนี้ทำให้แผนกเกินงบประมาณของเดือนนั้น ให้เลือกสถานะ "เกินงบ" — ระบบจะพิจารณายกระดับผู้อนุมัติให้สูงขึ้นเองตามยอดที่เกิน</w:t>
+        <w:t xml:space="preserve"> ถ้ารายการนี้ทำให้แผนกเกินงบประมาณของเดือนนั้น ให้เลือกสถานะ "เกินงบ" — ระบบจะพิจารณายกระดับผู้อนุมัติให้สูงขึ้นเองตามยอดที่เกิน</w:t>
       </w:r>
     </w:p>
     <w:p>
       <w:pPr>
         <w:keepNext/>
         <w:spacing w:before="280" w:after="120"/>
-        <w:rPr>
-          <w:rFonts w:hint="eastAsia"/>
-        </w:rPr>
       </w:pPr>
       <w:r>
         <w:rPr>
@@ -1198,29 +849,15 @@
           <w:color w:val="2563EB"/>
           <w:sz w:val="30"/>
         </w:rPr>
-        <w:t xml:space="preserve">3.1 </w:t>
-      </w:r>
-      <w:r>
-        <w:rPr>
-          <w:b/>
-          <w:color w:val="2563EB"/>
-          <w:sz w:val="30"/>
-        </w:rPr>
-        <w:t>กติกา MD Review</w:t>
+        <w:t>3.1 MD Review</w:t>
       </w:r>
     </w:p>
     <w:p>
       <w:pPr>
         <w:spacing w:after="120"/>
-        <w:rPr>
-          <w:rFonts w:hint="eastAsia"/>
-        </w:rPr>
-      </w:pPr>
-      <w:r>
-        <w:t>ถ้ารายการของคุณเข้าเงื่อนไขพิเศษตามระเบียบ Book1 ให้ติ๊กช่องที่เกี่ยวข้องในกล่อง "เงื่อนไขเพิ่มเติม (Book1)" ข้อที่</w:t>
-      </w:r>
-      <w:r>
-        <w:t>ควรรู้จักไว้ที่สุดคือ Supplier ปรับราคา ซึ่งเป็นฟีเจอร์ที่เพิ่งเปิดใช้งานล่าสุด</w:t>
+      </w:pPr>
+      <w:r>
+        <w:t>ถ้ารายการของคุณเข้าเงื่อนไขพิเศษตามระเบียบ Book1 ให้ติ๊กช่องที่เกี่ยวข้องในกล่อง "เงื่อนไขเพิ่มเติม (Book1)" ข้อที่ควรรู้จักไว้ที่สุดคือ Supplier ปรับราคา ซึ่งเป็นฟีเจอร์ที่เพิ่งเปิดใช้งานล่าสุด</w:t>
       </w:r>
     </w:p>
     <w:p>
@@ -1231,9 +868,6 @@
         <w:shd w:val="clear" w:color="auto" w:fill="FEF3E2"/>
         <w:spacing w:before="160"/>
         <w:ind w:left="80"/>
-        <w:rPr>
-          <w:rFonts w:hint="eastAsia"/>
-        </w:rPr>
       </w:pPr>
       <w:r>
         <w:rPr>
@@ -1241,24 +875,13 @@
           <w:color w:val="8A4A08"/>
           <w:sz w:val="21"/>
         </w:rPr>
-        <w:t>สำคัญ: ตั้งแต่เดือนกรกฎาคม 2569 เป็นต้นไป ถ้าเมโมของคุณติ๊ก "Supplier ปรับราคา" (เฉพาะรายการวัตถุดิบหรือสินทรัพย์ถาวร) เอกสารจะหยุดรอให้ MD พิจารณาก่อนเสมอ ผู้อนุมัติขั้นถัดไปจ</w:t>
-      </w:r>
-      <w:r>
-        <w:rPr>
-          <w:b/>
-          <w:color w:val="8A4A08"/>
-          <w:sz w:val="21"/>
-        </w:rPr>
-        <w:t>ะกดอนุมัติ ตีกลับ หรือปฏิเสธไม่ได้เลยจนกว่า MD จะตอบกลับมาก่อน</w:t>
+        <w:t>สำคัญ: ตั้งแต่เดือนกรกฎาคม 2569 เป็นต้นไป ถ้าเมโมของคุณติ๊ก "Supplier ปรับราคา" (เฉพาะรายการวัตถุดิบหรือสินทรัพย์ถาวร) เอกสารจะหยุดรอให้ MD พิจารณาก่อนเสมอ ผู้อนุมัติขั้นถัดไปจะกดอนุมัติ ตีกลับ หรือปฏิเสธไม่ได้เลยจนกว่า MD จะตอบกลับมาก่อน</w:t>
       </w:r>
     </w:p>
     <w:p>
       <w:pPr>
         <w:keepNext/>
         <w:spacing w:before="280" w:after="120"/>
-        <w:rPr>
-          <w:rFonts w:hint="eastAsia"/>
-        </w:rPr>
       </w:pPr>
       <w:r>
         <w:rPr>
@@ -1267,38 +890,21 @@
           <w:sz w:val="30"/>
         </w:rPr>
         <w:lastRenderedPageBreak/>
-        <w:t xml:space="preserve">3.2 </w:t>
-      </w:r>
-      <w:r>
-        <w:rPr>
-          <w:b/>
-          <w:color w:val="2563EB"/>
-          <w:sz w:val="30"/>
-        </w:rPr>
-        <w:t>เส้นทางอนุมัติ (Approver Routing)</w:t>
+        <w:t>3.2 เส้นทางอนุมัติ (Approver Routing)</w:t>
       </w:r>
     </w:p>
     <w:p>
       <w:pPr>
         <w:spacing w:after="120"/>
-        <w:rPr>
-          <w:rFonts w:hint="eastAsia"/>
-        </w:rPr>
-      </w:pPr>
-      <w:r>
-        <w:t xml:space="preserve">ทันทีที่คุณกรอกหมวดรายการและจำนวนเงินครบ แผงด้านขวาของฟอร์ม (ดูภาพในหัวข้อ 3) </w:t>
-      </w:r>
-      <w:r>
-        <w:t>จะคำนวณและแนะนำผู้อนุมัติที่เหมาะสมให้โดยอัตโนมัติ ตามกฎของ Book1 หากจำเป็นคุณสามารถเลือกผู้อนุมัติเองแทนคำแนะนำได้ แต่ระบบจะขอให้ระบุเหตุผลไว้ด้วย</w:t>
+      </w:pPr>
+      <w:r>
+        <w:t>ทันทีที่คุณกรอกหมวดรายการและจำนวนเงินครบ แผงด้านขวาของฟอร์ม (ดูภาพในหัวข้อ 3) จะคำนวณและแนะนำผู้อนุมัติที่เหมาะสมให้โดยอัตโนมัติ ตามกฎของ Book1 หากจำเป็นคุณสามารถเลือกผู้อนุมัติเองแทนคำแนะนำได้ แต่ระบบจะขอให้ระบุเหตุผลไว้ด้วย</w:t>
       </w:r>
     </w:p>
     <w:p>
       <w:pPr>
         <w:pStyle w:val="ListBullet"/>
         <w:spacing w:after="80"/>
-        <w:rPr>
-          <w:rFonts w:hint="eastAsia"/>
-        </w:rPr>
       </w:pPr>
       <w:r>
         <w:rPr>
@@ -1311,22 +917,13 @@
         <w:rPr>
           <w:sz w:val="21"/>
         </w:rPr>
-        <w:t xml:space="preserve"> </w:t>
-      </w:r>
-      <w:r>
-        <w:rPr>
-          <w:sz w:val="21"/>
-        </w:rPr>
-        <w:t>บอกระดับผู้อนุมัติสุดท้ายที่ระบบแนะนำ (Manager / GM / MD)</w:t>
+        <w:t xml:space="preserve"> บอกระดับผู้อนุมัติสุดท้ายที่ระบบแนะนำ (Manager / GM / MD)</w:t>
       </w:r>
     </w:p>
     <w:p>
       <w:pPr>
         <w:pStyle w:val="ListBullet"/>
         <w:spacing w:after="80"/>
-        <w:rPr>
-          <w:rFonts w:hint="eastAsia"/>
-        </w:rPr>
       </w:pPr>
       <w:r>
         <w:rPr>
@@ -1339,34 +936,13 @@
         <w:rPr>
           <w:sz w:val="21"/>
         </w:rPr>
-        <w:t xml:space="preserve"> </w:t>
-      </w:r>
-      <w:r>
-        <w:rPr>
-          <w:sz w:val="21"/>
-        </w:rPr>
-        <w:t>ขึ้นคำว่า "recommended</w:t>
-      </w:r>
-      <w:r>
-        <w:rPr>
-          <w:sz w:val="21"/>
-        </w:rPr>
-        <w:t xml:space="preserve">" </w:t>
-      </w:r>
-      <w:r>
-        <w:rPr>
-          <w:sz w:val="21"/>
-        </w:rPr>
-        <w:t>ถ้าคุณใช้ตามคำแนะนำ หรือ "exception" ถ้าคุณเลือกผู้อนุมัติสูงหรือต่ำกว่าที่แนะนำ</w:t>
+        <w:t xml:space="preserve"> ขึ้นคำว่า "recommended" ถ้าคุณใช้ตามคำแนะนำ หรือ "exception" ถ้าคุณเลือกผู้อนุมัติสูงหรือต่ำกว่าที่แนะนำ</w:t>
       </w:r>
     </w:p>
     <w:p>
       <w:pPr>
         <w:pStyle w:val="ListBullet"/>
         <w:spacing w:after="80"/>
-        <w:rPr>
-          <w:rFonts w:hint="eastAsia"/>
-        </w:rPr>
       </w:pPr>
       <w:r>
         <w:rPr>
@@ -1379,22 +955,13 @@
         <w:rPr>
           <w:sz w:val="21"/>
         </w:rPr>
-        <w:t xml:space="preserve"> </w:t>
-      </w:r>
-      <w:r>
-        <w:rPr>
-          <w:sz w:val="21"/>
-        </w:rPr>
-        <w:t>ไม่ว่าจะเลือกเส้นทางไหน ขั้น Manager / Top Section เป็นด่านแรกเสมอ ก่อนจะส่งต่อไปยังระดับที่กำหนดไว้</w:t>
+        <w:t xml:space="preserve"> ไม่ว่าจะเลือกเส้นทางไหน ขั้น Manager / Top Section เป็นด่านแรกเสมอ ก่อนจะส่งต่อไปยังระดับที่กำหนดไว้</w:t>
       </w:r>
     </w:p>
     <w:p>
       <w:pPr>
         <w:keepNext/>
         <w:spacing w:before="200" w:after="80"/>
-        <w:rPr>
-          <w:rFonts w:hint="eastAsia"/>
-        </w:rPr>
       </w:pPr>
       <w:r>
         <w:rPr>
@@ -1408,16 +975,13 @@
     <w:p>
       <w:pPr>
         <w:jc w:val="center"/>
-        <w:rPr>
-          <w:rFonts w:hint="eastAsia"/>
-        </w:rPr>
       </w:pPr>
       <w:r>
         <w:rPr>
           <w:noProof/>
         </w:rPr>
         <w:drawing>
-          <wp:inline distT="0" distB="0" distL="0" distR="0" wp14:anchorId="11AD3390" wp14:editId="3C9FDC33">
+          <wp:inline distT="0" distB="0" distL="0" distR="0" wp14:anchorId="074F8AE1" wp14:editId="118F8B1F">
             <wp:extent cx="5760720" cy="3600450"/>
             <wp:effectExtent l="0" t="0" r="0" b="0"/>
             <wp:docPr id="4" name="Picture 4"/>
@@ -1457,9 +1021,6 @@
       <w:pPr>
         <w:spacing w:after="280"/>
         <w:jc w:val="center"/>
-        <w:rPr>
-          <w:rFonts w:hint="eastAsia"/>
-        </w:rPr>
       </w:pPr>
       <w:r>
         <w:rPr>
@@ -1467,24 +1028,13 @@
           <w:color w:val="64748B"/>
           <w:sz w:val="19"/>
         </w:rPr>
-        <w:t>ภาพหน้าจอจริง — ส่วนรายการที</w:t>
-      </w:r>
-      <w:r>
-        <w:rPr>
-          <w:i/>
-          <w:color w:val="64748B"/>
-          <w:sz w:val="19"/>
-        </w:rPr>
-        <w:t>่ขออนุมัติ (Request Items) และเอกสารแนบ ในหน้าเดียวกัน</w:t>
+        <w:t>ภาพหน้าจอจริง — ส่วนรายการที่ขออนุมัติ (Request Items) และเอกสารแนบ ในหน้าเดียวกัน</w:t>
       </w:r>
     </w:p>
     <w:p>
       <w:pPr>
         <w:pStyle w:val="ListBullet"/>
         <w:spacing w:after="80"/>
-        <w:rPr>
-          <w:rFonts w:hint="eastAsia"/>
-        </w:rPr>
       </w:pPr>
       <w:r>
         <w:rPr>
@@ -1497,22 +1047,13 @@
         <w:rPr>
           <w:sz w:val="21"/>
         </w:rPr>
-        <w:t xml:space="preserve"> </w:t>
-      </w:r>
-      <w:r>
-        <w:rPr>
-          <w:sz w:val="21"/>
-        </w:rPr>
-        <w:t>ระบุชื่อรายการ จำนวน และราคาต่อหน่วย ระบบคำนวณยอดรวมให้อัตโนมัติ เพิ่มได้หลายรายการ</w:t>
+        <w:t xml:space="preserve"> ระบุชื่อรายการ จำนวน และราคาต่อหน่วย ระบบคำนวณยอดรวมให้อัตโนมัติ เพิ่มได้หลายรายการ</w:t>
       </w:r>
     </w:p>
     <w:p>
       <w:pPr>
         <w:pStyle w:val="ListBullet"/>
         <w:spacing w:after="80"/>
-        <w:rPr>
-          <w:rFonts w:hint="eastAsia"/>
-        </w:rPr>
       </w:pPr>
       <w:r>
         <w:rPr>
@@ -1525,22 +1066,224 @@
         <w:rPr>
           <w:sz w:val="21"/>
         </w:rPr>
-        <w:t xml:space="preserve"> </w:t>
-      </w:r>
-      <w:r>
-        <w:rPr>
-          <w:sz w:val="21"/>
-        </w:rPr>
-        <w:t>แนบใบเสนอราคาหรือเอกสารประกอบ ไฟล์ละไม่เกิน 10MB (รองรับ PDF, Word, Excel, รูปภาพ)</w:t>
+        <w:t xml:space="preserve"> แนบใบเสนอราคาหรือเอกสารประกอบ ไฟล์ละไม่เกิน 10MB (รองรับ PDF, Word, Excel, รูปภาพ)</w:t>
       </w:r>
     </w:p>
     <w:p>
       <w:pPr>
+        <w:spacing w:before="280" w:after="120"/>
+        <w:rPr>
+          <w:b/>
+          <w:color w:val="2563EB"/>
+          <w:sz w:val="30"/>
+        </w:rPr>
+      </w:pPr>
+    </w:p>
+    <w:p>
+      <w:pPr>
+        <w:spacing w:before="280" w:after="120"/>
+        <w:rPr>
+          <w:b/>
+          <w:color w:val="2563EB"/>
+          <w:sz w:val="30"/>
+        </w:rPr>
+      </w:pPr>
+    </w:p>
+    <w:p>
+      <w:pPr>
+        <w:spacing w:before="280" w:after="120"/>
+        <w:rPr>
+          <w:b/>
+          <w:color w:val="2563EB"/>
+          <w:sz w:val="30"/>
+        </w:rPr>
+      </w:pPr>
+    </w:p>
+    <w:p>
+      <w:pPr>
+        <w:spacing w:before="280" w:after="120"/>
+      </w:pPr>
+      <w:r>
+        <w:rPr>
+          <w:b/>
+          <w:color w:val="2563EB"/>
+          <w:sz w:val="30"/>
+        </w:rPr>
+        <w:lastRenderedPageBreak/>
+        <w:t xml:space="preserve">3.3 </w:t>
+      </w:r>
+      <w:r>
+        <w:rPr>
+          <w:b/>
+          <w:color w:val="2563EB"/>
+          <w:sz w:val="30"/>
+        </w:rPr>
+        <w:t>ใช้แม่แบบ (Template) ลดเวลากรอกฟอร์ม</w:t>
+      </w:r>
+    </w:p>
+    <w:p>
+      <w:pPr>
+        <w:spacing w:after="120"/>
+      </w:pPr>
+      <w:r>
+        <w:t>ถ้าเคยส่งเมโมลักษณะนี้มาก่อน (เช่น รายการซื้อวัสดุสิ้นเปลืองประจำเดือน) ไม่ต้องกรอกใหม่ทั้งหมดทุกครั้ง เหนือช่อง “รายละเอียด Memo” จะมีการ์ด “โหลดจากแม่แบบคำขออนุมัติ” ให้ใช้งานได้ดังนี้</w:t>
+      </w:r>
+    </w:p>
+    <w:p>
+      <w:pPr>
+        <w:pStyle w:val="ListBullet"/>
+        <w:spacing w:after="80"/>
+      </w:pPr>
+      <w:r>
+        <w:rPr>
+          <w:b/>
+          <w:sz w:val="21"/>
+        </w:rPr>
+        <w:t>โหลดแม่แบบ —</w:t>
+      </w:r>
+      <w:r>
+        <w:rPr>
+          <w:sz w:val="21"/>
+        </w:rPr>
+        <w:t xml:space="preserve"> </w:t>
+      </w:r>
+      <w:r>
+        <w:rPr>
+          <w:sz w:val="21"/>
+        </w:rPr>
+        <w:t xml:space="preserve">คลิกชื่อแม่แบบในการ์ดด้านบนของฟอร์ม ระบบจะดึงข้อมูลเดิม </w:t>
+      </w:r>
+      <w:r>
+        <w:rPr>
+          <w:sz w:val="21"/>
+        </w:rPr>
+        <w:t>(</w:t>
+      </w:r>
+      <w:r>
+        <w:rPr>
+          <w:sz w:val="21"/>
+        </w:rPr>
+        <w:t>หมวดหมู่ แผนก จำนวนเงิน รายการสินค้า ราคาเปรียบเทียบ ฯลฯ) กลับเข้าฟอร์มทันที จากนั้นแก้ไขเฉพาะส่วนที่ต่างจากเดิมแล้วส่งได้เลย</w:t>
+      </w:r>
+    </w:p>
+    <w:p>
+      <w:pPr>
+        <w:pStyle w:val="ListBullet"/>
+        <w:spacing w:after="80"/>
+      </w:pPr>
+      <w:r>
+        <w:rPr>
+          <w:b/>
+          <w:sz w:val="21"/>
+        </w:rPr>
+        <w:t>บันทึกเป็นแม่แบบใหม่ —</w:t>
+      </w:r>
+      <w:r>
+        <w:rPr>
+          <w:sz w:val="21"/>
+        </w:rPr>
+        <w:t xml:space="preserve"> </w:t>
+      </w:r>
+      <w:r>
+        <w:rPr>
+          <w:sz w:val="21"/>
+        </w:rPr>
+        <w:t>กรอกฟอร์มให้ครบตามต้องการ แล้วกดปุ่ม Save Template ที่มุมขวาบนของหน้า ตั้งชื่อให้จำง่าย แล้วกดบันทึก</w:t>
+      </w:r>
+    </w:p>
+    <w:p>
+      <w:pPr>
+        <w:pStyle w:val="ListBullet"/>
+        <w:spacing w:after="80"/>
+      </w:pPr>
+      <w:r>
+        <w:rPr>
+          <w:b/>
+          <w:sz w:val="21"/>
+        </w:rPr>
+        <w:t>ลบแม่</w:t>
+      </w:r>
+      <w:r>
+        <w:rPr>
+          <w:b/>
+          <w:sz w:val="21"/>
+        </w:rPr>
+        <w:t>แบบ —</w:t>
+      </w:r>
+      <w:r>
+        <w:rPr>
+          <w:sz w:val="21"/>
+        </w:rPr>
+        <w:t xml:space="preserve"> </w:t>
+      </w:r>
+      <w:r>
+        <w:rPr>
+          <w:sz w:val="21"/>
+        </w:rPr>
+        <w:t>คลิกไอคอน × ข้างชื่อแม่แบบในการ์ดด้านบน เพื่อลบแม่แบบที่ไม่ใช้แล้ว</w:t>
+      </w:r>
+    </w:p>
+    <w:p>
+      <w:pPr>
+        <w:pStyle w:val="ListBullet"/>
+        <w:spacing w:after="80"/>
+      </w:pPr>
+      <w:r>
+        <w:rPr>
+          <w:b/>
+          <w:sz w:val="21"/>
+        </w:rPr>
+        <w:t>ข้อควรทราบ —</w:t>
+      </w:r>
+      <w:r>
+        <w:rPr>
+          <w:sz w:val="21"/>
+        </w:rPr>
+        <w:t xml:space="preserve"> </w:t>
+      </w:r>
+      <w:r>
+        <w:rPr>
+          <w:sz w:val="21"/>
+        </w:rPr>
+        <w:t>แม่แบบเป็นของบัญชีผู้ใช้แต่ละคนเท่านั้น คนอื่นจะไม่เห็นแม่แบบที่คุณบันทึกไว้ และไม่รวมไฟล์แนบกับวันที่ — ต้องแนบไฟล์และตรวจวันที่ใหม่ทุกครั้งหลังโหลดแม่แบบ</w:t>
+      </w:r>
+    </w:p>
+    <w:p>
+      <w:pPr>
+        <w:pStyle w:val="ListBullet"/>
+        <w:spacing w:after="80"/>
+      </w:pPr>
+      <w:r>
+        <w:rPr>
+          <w:b/>
+          <w:sz w:val="21"/>
+        </w:rPr>
+        <w:t>ขอบเขตการใช้งา</w:t>
+      </w:r>
+      <w:r>
+        <w:rPr>
+          <w:b/>
+          <w:sz w:val="21"/>
+        </w:rPr>
+        <w:t>น —</w:t>
+      </w:r>
+      <w:r>
+        <w:rPr>
+          <w:sz w:val="21"/>
+        </w:rPr>
+        <w:t xml:space="preserve"> </w:t>
+      </w:r>
+      <w:r>
+        <w:rPr>
+          <w:sz w:val="21"/>
+        </w:rPr>
+        <w:t>ใช้ได้เฉพาะตอนสร้างเมโมใหม่เท่านั้น ไม่แสดงในโหมด “แก้ไขและส่งใหม่” (revision)</w:t>
+      </w:r>
+    </w:p>
+    <w:p>
+      <w:pPr>
         <w:keepNext/>
         <w:pageBreakBefore/>
-        <w:rPr>
-          <w:rFonts w:hint="eastAsia"/>
-        </w:rPr>
       </w:pPr>
       <w:r>
         <w:rPr>
@@ -1549,23 +1292,12 @@
           <w:sz w:val="40"/>
         </w:rPr>
         <w:lastRenderedPageBreak/>
-        <w:t xml:space="preserve">4. Approval Queue — </w:t>
-      </w:r>
-      <w:r>
-        <w:rPr>
-          <w:b/>
-          <w:color w:val="0B142C"/>
-          <w:sz w:val="40"/>
-        </w:rPr>
-        <w:t>ติดตามสถานะ</w:t>
+        <w:t>4. Approval Queue — ติดตามสถานะ</w:t>
       </w:r>
     </w:p>
     <w:p>
       <w:pPr>
         <w:spacing w:after="120"/>
-        <w:rPr>
-          <w:rFonts w:hint="eastAsia"/>
-        </w:rPr>
       </w:pPr>
       <w:r>
         <w:t>หน้านี้รวมสถานะเอกสารทั้งหมดที่เกี่ยวข้องกับคุณไว้ในที่เดียว ทั้งเมโมที่คุณส่งเอง และเมโมที่รอให้คุณอนุมัติ</w:t>
@@ -1574,16 +1306,13 @@
     <w:p>
       <w:pPr>
         <w:jc w:val="center"/>
-        <w:rPr>
-          <w:rFonts w:hint="eastAsia"/>
-        </w:rPr>
       </w:pPr>
       <w:r>
         <w:rPr>
           <w:noProof/>
         </w:rPr>
         <w:drawing>
-          <wp:inline distT="0" distB="0" distL="0" distR="0" wp14:anchorId="5BCF75E7" wp14:editId="40EB15E8">
+          <wp:inline distT="0" distB="0" distL="0" distR="0" wp14:anchorId="4AD8CC46" wp14:editId="7A21731E">
             <wp:extent cx="5760720" cy="3600450"/>
             <wp:effectExtent l="0" t="0" r="0" b="0"/>
             <wp:docPr id="5" name="Picture 5"/>
@@ -1623,9 +1352,6 @@
       <w:pPr>
         <w:spacing w:after="280"/>
         <w:jc w:val="center"/>
-        <w:rPr>
-          <w:rFonts w:hint="eastAsia"/>
-        </w:rPr>
       </w:pPr>
       <w:r>
         <w:rPr>
@@ -1640,9 +1366,6 @@
       <w:pPr>
         <w:pStyle w:val="ListBullet"/>
         <w:spacing w:after="80"/>
-        <w:rPr>
-          <w:rFonts w:hint="eastAsia"/>
-        </w:rPr>
       </w:pPr>
       <w:r>
         <w:rPr>
@@ -1655,28 +1378,13 @@
         <w:rPr>
           <w:sz w:val="21"/>
         </w:rPr>
-        <w:t xml:space="preserve"> All / Pending / Approved / Rejected / Return</w:t>
-      </w:r>
-      <w:r>
-        <w:rPr>
-          <w:sz w:val="21"/>
-        </w:rPr>
-        <w:t xml:space="preserve">ed / Draft </w:t>
-      </w:r>
-      <w:r>
-        <w:rPr>
-          <w:sz w:val="21"/>
-        </w:rPr>
-        <w:t>คลิกเพื่อกรองดูเฉพาะสถานะที่ต้องการได้ทันที</w:t>
+        <w:t xml:space="preserve"> All / Pending / Approved / Rejected / Returned / Draft คลิกเพื่อกรองดูเฉพาะสถานะที่ต้องการได้ทันที</w:t>
       </w:r>
     </w:p>
     <w:p>
       <w:pPr>
         <w:pStyle w:val="ListBullet"/>
         <w:spacing w:after="80"/>
-        <w:rPr>
-          <w:rFonts w:hint="eastAsia"/>
-        </w:rPr>
       </w:pPr>
       <w:r>
         <w:rPr>
@@ -1689,22 +1397,13 @@
         <w:rPr>
           <w:sz w:val="21"/>
         </w:rPr>
-        <w:t xml:space="preserve"> </w:t>
-      </w:r>
-      <w:r>
-        <w:rPr>
-          <w:sz w:val="21"/>
-        </w:rPr>
-        <w:t>มีประโยชน์เมื่อรายการเยอะ และต้องการหาเฉพาะเมโมของระดับหรือช่วงเวลาหนึ่ง</w:t>
+        <w:t xml:space="preserve"> มีประโยชน์เมื่อรายการเยอะ และต้องการหาเฉพาะเมโมของระดับหรือช่วงเวลาหนึ่ง</w:t>
       </w:r>
     </w:p>
     <w:p>
       <w:pPr>
         <w:keepNext/>
         <w:spacing w:before="200" w:after="80"/>
-        <w:rPr>
-          <w:rFonts w:hint="eastAsia"/>
-        </w:rPr>
       </w:pPr>
       <w:r>
         <w:rPr>
@@ -1719,16 +1418,13 @@
     <w:p>
       <w:pPr>
         <w:jc w:val="center"/>
-        <w:rPr>
-          <w:rFonts w:hint="eastAsia"/>
-        </w:rPr>
       </w:pPr>
       <w:r>
         <w:rPr>
           <w:noProof/>
         </w:rPr>
         <w:drawing>
-          <wp:inline distT="0" distB="0" distL="0" distR="0" wp14:anchorId="15B429D8" wp14:editId="3BB5FEAA">
+          <wp:inline distT="0" distB="0" distL="0" distR="0" wp14:anchorId="704A2FFF" wp14:editId="69202B44">
             <wp:extent cx="5760720" cy="3600450"/>
             <wp:effectExtent l="0" t="0" r="0" b="0"/>
             <wp:docPr id="6" name="Picture 6"/>
@@ -1768,9 +1464,6 @@
       <w:pPr>
         <w:spacing w:after="280"/>
         <w:jc w:val="center"/>
-        <w:rPr>
-          <w:rFonts w:hint="eastAsia"/>
-        </w:rPr>
       </w:pPr>
       <w:r>
         <w:rPr>
@@ -1785,9 +1478,6 @@
       <w:pPr>
         <w:pStyle w:val="ListBullet"/>
         <w:spacing w:after="80"/>
-        <w:rPr>
-          <w:rFonts w:hint="eastAsia"/>
-        </w:rPr>
       </w:pPr>
       <w:r>
         <w:rPr>
@@ -1800,28 +1490,13 @@
         <w:rPr>
           <w:sz w:val="21"/>
         </w:rPr>
-        <w:t xml:space="preserve"> </w:t>
-      </w:r>
-      <w:r>
-        <w:rPr>
-          <w:sz w:val="21"/>
-        </w:rPr>
-        <w:t>คลิกที่แถวไหน</w:t>
-      </w:r>
-      <w:r>
-        <w:rPr>
-          <w:sz w:val="21"/>
-        </w:rPr>
-        <w:t>ก็ได้เพื่อเปิดรายละเอียดแบบ drawer จะเห็นเนื้อหาเต็ม เอกสารแนบ เส้นทางอนุมัติ และไทม์ไลน์การดำเนินการทั้งหมด</w:t>
+        <w:t xml:space="preserve"> คลิกที่แถวไหนก็ได้เพื่อเปิดรายละเอียดแบบ drawer จะเห็นเนื้อหาเต็ม เอกสารแนบ เส้นทางอนุมัติ และไทม์ไลน์การดำเนินการทั้งหมด</w:t>
       </w:r>
     </w:p>
     <w:p>
       <w:pPr>
         <w:keepNext/>
         <w:pageBreakBefore/>
-        <w:rPr>
-          <w:rFonts w:hint="eastAsia"/>
-        </w:rPr>
       </w:pPr>
       <w:r>
         <w:rPr>
@@ -1830,41 +1505,21 @@
           <w:sz w:val="40"/>
         </w:rPr>
         <w:lastRenderedPageBreak/>
-        <w:t xml:space="preserve">5. </w:t>
-      </w:r>
-      <w:r>
-        <w:rPr>
-          <w:b/>
-          <w:color w:val="0B142C"/>
-          <w:sz w:val="40"/>
-        </w:rPr>
-        <w:t>สำหรับผู้อนุมัติ (Manager / GM / MD)</w:t>
+        <w:t>5. สำหรับผู้อนุมัติ (Manager / GM / MD)</w:t>
       </w:r>
     </w:p>
     <w:p>
       <w:pPr>
         <w:spacing w:after="120"/>
-        <w:rPr>
-          <w:rFonts w:hint="eastAsia"/>
-        </w:rPr>
-      </w:pPr>
-      <w:r>
-        <w:t>ถ้าบทบาทของคุณอยู่ในสายอนุมัติ เมื่อเปิดดูรายละเอียดของเมโมที่รอคุณพิจารณา จะเห็นปุ่มดำเนินการอยู่ท้าย draw</w:t>
-      </w:r>
-      <w:r>
-        <w:t>er (</w:t>
-      </w:r>
-      <w:r>
-        <w:t>ดูโครงหน้าจอเดียวกับหัวข้อ 4)</w:t>
+      </w:pPr>
+      <w:r>
+        <w:t>ถ้าบทบาทของคุณอยู่ในสายอนุมัติ เมื่อเปิดดูรายละเอียดของเมโมที่รอคุณพิจารณา จะเห็นปุ่มดำเนินการอยู่ท้าย drawer (ดูโครงหน้าจอเดียวกับหัวข้อ 4)</w:t>
       </w:r>
     </w:p>
     <w:p>
       <w:pPr>
         <w:pStyle w:val="ListBullet"/>
         <w:spacing w:after="80"/>
-        <w:rPr>
-          <w:rFonts w:hint="eastAsia"/>
-        </w:rPr>
       </w:pPr>
       <w:r>
         <w:rPr>
@@ -1877,22 +1532,13 @@
         <w:rPr>
           <w:sz w:val="21"/>
         </w:rPr>
-        <w:t xml:space="preserve"> </w:t>
-      </w:r>
-      <w:r>
-        <w:rPr>
-          <w:sz w:val="21"/>
-        </w:rPr>
-        <w:t>อนุมัติเอกสารนี้ และส่งต่อไปยังขั้นถัดไปในเส้นทางอนุมัติโดยอัตโนมัติ</w:t>
+        <w:t xml:space="preserve"> อนุมัติเอกสารนี้ และส่งต่อไปยังขั้นถัดไปในเส้นทางอนุมัติโดยอัตโนมัติ</w:t>
       </w:r>
     </w:p>
     <w:p>
       <w:pPr>
         <w:pStyle w:val="ListBullet"/>
         <w:spacing w:after="80"/>
-        <w:rPr>
-          <w:rFonts w:hint="eastAsia"/>
-        </w:rPr>
       </w:pPr>
       <w:r>
         <w:rPr>
@@ -1905,22 +1551,13 @@
         <w:rPr>
           <w:sz w:val="21"/>
         </w:rPr>
-        <w:t xml:space="preserve"> </w:t>
-      </w:r>
-      <w:r>
-        <w:rPr>
-          <w:sz w:val="21"/>
-        </w:rPr>
-        <w:t>ตีกลับให้ผู้ขอนำไปแก้ไข พร้อมระบุเหตุผลให้ชัดเจน หลังแก้ไขแล้วเอกสารจะย้อนกลับไปเริ่มพิจารณาที่ Manager ใหม่อีกครั้ง</w:t>
+        <w:t xml:space="preserve"> ตีกลับให้ผู้ขอนำไปแก้ไข พร้อมระบุเหตุผลให้ชัดเจน หลังแก้ไขแล้วเอกสารจะย้อนกลับไปเริ่มพิจารณาที่ Manager ใหม่อีกครั้ง</w:t>
       </w:r>
     </w:p>
     <w:p>
       <w:pPr>
         <w:pStyle w:val="ListBullet"/>
         <w:spacing w:after="80"/>
-        <w:rPr>
-          <w:rFonts w:hint="eastAsia"/>
-        </w:rPr>
       </w:pPr>
       <w:r>
         <w:rPr>
@@ -1933,13 +1570,7 @@
         <w:rPr>
           <w:sz w:val="21"/>
         </w:rPr>
-        <w:t xml:space="preserve"> </w:t>
-      </w:r>
-      <w:r>
-        <w:rPr>
-          <w:sz w:val="21"/>
-        </w:rPr>
-        <w:t>ปฏิเสธเอกสาร โดยเลือกได้ว่าจะ "ปิดถาวร" ไม่ให้แก้ไขต่อ หรือ "อนุญาตให้แก้ไขและส่งใหม่" (revision-allowed)</w:t>
+        <w:t xml:space="preserve"> ปฏิเสธเอกสาร โดยเลือกได้ว่าจะ "ปิดถาวร" ไม่ให้แก้ไขต่อ หรือ "อนุญาตให้แก้ไขและส่งใหม่" (revision-allowed)</w:t>
       </w:r>
     </w:p>
     <w:p>
@@ -1950,9 +1581,6 @@
         <w:shd w:val="clear" w:color="auto" w:fill="FEF3E2"/>
         <w:spacing w:before="160"/>
         <w:ind w:left="80"/>
-        <w:rPr>
-          <w:rFonts w:hint="eastAsia"/>
-        </w:rPr>
       </w:pPr>
       <w:r>
         <w:rPr>
@@ -1960,32 +1588,13 @@
           <w:color w:val="8A4A08"/>
           <w:sz w:val="21"/>
         </w:rPr>
-        <w:t>สำคัญ: ถ้าคุณคือ Managi</w:t>
-      </w:r>
-      <w:r>
-        <w:rPr>
-          <w:b/>
-          <w:color w:val="8A4A08"/>
-          <w:sz w:val="21"/>
-        </w:rPr>
-        <w:t xml:space="preserve">ng Director </w:t>
-      </w:r>
-      <w:r>
-        <w:rPr>
-          <w:b/>
-          <w:color w:val="8A4A08"/>
-          <w:sz w:val="21"/>
-        </w:rPr>
-        <w:t>และเมโมมีเครื่องหมาย "ต้องผ่านการพิจารณาของ MD" ปุ่มที่เห็นจะเปลี่ยนจาก Approve ปกติ เป็น 4 ทางเลือกเฉพาะสำหรับ MD Review แทน เอกสารจะขยับต่อไม่ได้จนกว่าคุณจะตอบกลับ</w:t>
+        <w:t>สำคัญ: ถ้าคุณคือ Managing Director และเมโมมีเครื่องหมาย "ต้องผ่านการพิจารณาของ MD" ปุ่มที่เห็นจะเปลี่ยนจาก Approve ปกติ เป็น 4 ทางเลือกเฉพาะสำหรับ MD Review แทน เอกสารจะขยับต่อไม่ได้จนกว่าคุณจะตอบกลับ</w:t>
       </w:r>
     </w:p>
     <w:p>
       <w:pPr>
         <w:pStyle w:val="ListBullet"/>
         <w:spacing w:after="80"/>
-        <w:rPr>
-          <w:rFonts w:hint="eastAsia"/>
-        </w:rPr>
       </w:pPr>
       <w:r>
         <w:rPr>
@@ -1998,119 +1607,70 @@
         <w:rPr>
           <w:sz w:val="21"/>
         </w:rPr>
-        <w:t xml:space="preserve"> </w:t>
-      </w:r>
-      <w:r>
-        <w:rPr>
-          <w:sz w:val="21"/>
-        </w:rPr>
-        <w:t>ยอมรับราคาที่ปรับ เอกสารเดินหน้าเข้าสู่สายอนุมัติปกติทันที</w:t>
+        <w:t xml:space="preserve"> ยอมรับราคาที่ปรับ เอกสารเดินหน้าเข้าสู่สายอนุมัติปกติทันที</w:t>
       </w:r>
     </w:p>
     <w:p>
       <w:pPr>
         <w:pStyle w:val="ListBullet"/>
         <w:spacing w:after="80"/>
-        <w:rPr>
-          <w:rFonts w:hint="eastAsia"/>
-        </w:rPr>
       </w:pPr>
       <w:r>
         <w:rPr>
           <w:b/>
           <w:sz w:val="21"/>
         </w:rPr>
-        <w:t>ไม่เห็นชอ</w:t>
-      </w:r>
+        <w:t>ไม่เห็นชอบ —</w:t>
+      </w:r>
+      <w:r>
+        <w:rPr>
+          <w:sz w:val="21"/>
+        </w:rPr>
+        <w:t xml:space="preserve"> ไม่ยอมรับการปรับราคา เอกสารจะหยุดหรือถูกตีกลับตามที่ตั้งค่าไว้</w:t>
+      </w:r>
+    </w:p>
+    <w:p>
+      <w:pPr>
+        <w:pStyle w:val="ListBullet"/>
+        <w:spacing w:after="80"/>
+      </w:pPr>
       <w:r>
         <w:rPr>
           <w:b/>
           <w:sz w:val="21"/>
         </w:rPr>
-        <w:t>บ —</w:t>
+        <w:t>ให้ความเห็น —</w:t>
       </w:r>
       <w:r>
         <w:rPr>
           <w:sz w:val="21"/>
         </w:rPr>
-        <w:t xml:space="preserve"> </w:t>
-      </w:r>
-      <w:r>
-        <w:rPr>
-          <w:sz w:val="21"/>
-        </w:rPr>
-        <w:t>ไม่ยอมรับการปรับราคา เอกสารจะหยุดหรือถูกตีกลับตามที่ตั้งค่าไว้</w:t>
+        <w:t xml:space="preserve"> พิมพ์ข้อความความเห็นส่งกลับไป ทำได้จากในเว็บ หรือตอบกลับข้อความใน Telegram ก็ได้เช่นกัน</w:t>
       </w:r>
     </w:p>
     <w:p>
       <w:pPr>
         <w:pStyle w:val="ListBullet"/>
         <w:spacing w:after="80"/>
-        <w:rPr>
-          <w:rFonts w:hint="eastAsia"/>
-        </w:rPr>
       </w:pPr>
       <w:r>
         <w:rPr>
           <w:b/>
           <w:sz w:val="21"/>
         </w:rPr>
-        <w:t>ให้ความเห็น —</w:t>
+        <w:t>ขอให้แก้ไขใหม่ —</w:t>
       </w:r>
       <w:r>
         <w:rPr>
           <w:sz w:val="21"/>
         </w:rPr>
-        <w:t xml:space="preserve"> </w:t>
-      </w:r>
-      <w:r>
-        <w:rPr>
-          <w:sz w:val="21"/>
-        </w:rPr>
-        <w:t>พิมพ์ข้อความความเห็นส่งกลับไป ทำได้จากในเว็บ หรือตอบกลับข้อความใน Telegram ก็ได้เช่นกัน</w:t>
+        <w:t xml:space="preserve"> ส่งกลับให้ผู้ขอปรับรายละเอียดราคาหรือเหตุผลเพิ่มเติม ก่อนจะนำมาพิจารณาอีกครั้ง</w:t>
       </w:r>
     </w:p>
     <w:p>
       <w:pPr>
-        <w:pStyle w:val="ListBullet"/>
-        <w:spacing w:after="80"/>
-        <w:rPr>
-          <w:rFonts w:hint="eastAsia"/>
-        </w:rPr>
-      </w:pPr>
-      <w:r>
-        <w:rPr>
-          <w:b/>
-          <w:sz w:val="21"/>
-        </w:rPr>
-        <w:t>ขอให้แก้ไขใหม่ —</w:t>
-      </w:r>
-      <w:r>
-        <w:rPr>
-          <w:sz w:val="21"/>
-        </w:rPr>
-        <w:t xml:space="preserve"> </w:t>
-      </w:r>
-      <w:r>
-        <w:rPr>
-          <w:sz w:val="21"/>
-        </w:rPr>
-        <w:t>ส่งกลับให้ผู้ขอปรับรายละเอียดราคาหรือเหตุผลเพิ่มเติม ก่อนจะนำมาพิจารณา</w:t>
-      </w:r>
-      <w:r>
-        <w:rPr>
-          <w:sz w:val="21"/>
-        </w:rPr>
-        <w:t>อีกครั้ง</w:t>
-      </w:r>
-    </w:p>
-    <w:p>
-      <w:pPr>
         <w:keepNext/>
         <w:pageBreakBefore/>
-        <w:rPr>
-          <w:rFonts w:hint="eastAsia"/>
-        </w:rPr>
       </w:pPr>
       <w:r>
         <w:rPr>
@@ -2119,23 +1679,12 @@
           <w:sz w:val="40"/>
         </w:rPr>
         <w:lastRenderedPageBreak/>
-        <w:t xml:space="preserve">6. </w:t>
-      </w:r>
-      <w:r>
-        <w:rPr>
-          <w:b/>
-          <w:color w:val="0B142C"/>
-          <w:sz w:val="40"/>
-        </w:rPr>
-        <w:t>ประวัติเอกสารและรายงาน</w:t>
+        <w:t>6. ประวัติเอกสารและรายงาน</w:t>
       </w:r>
     </w:p>
     <w:p>
       <w:pPr>
         <w:spacing w:after="120"/>
-        <w:rPr>
-          <w:rFonts w:hint="eastAsia"/>
-        </w:rPr>
       </w:pPr>
       <w:r>
         <w:t>หน้านี้รวบรวมสถิติของทุกเมโมที่ผ่านมือคุณ พร้อมไทม์ไลน์การอนุมัติแบบละเอียด เหมาะสำหรับตรวจสอบย้อนหลังหรือทำรายงานเสนอผู้บริหาร</w:t>
@@ -2144,16 +1693,13 @@
     <w:p>
       <w:pPr>
         <w:jc w:val="center"/>
-        <w:rPr>
-          <w:rFonts w:hint="eastAsia"/>
-        </w:rPr>
       </w:pPr>
       <w:r>
         <w:rPr>
           <w:noProof/>
         </w:rPr>
         <w:drawing>
-          <wp:inline distT="0" distB="0" distL="0" distR="0" wp14:anchorId="4FF78644" wp14:editId="65E6B59E">
+          <wp:inline distT="0" distB="0" distL="0" distR="0" wp14:anchorId="1228C39F" wp14:editId="40E55E2A">
             <wp:extent cx="5760720" cy="3600450"/>
             <wp:effectExtent l="0" t="0" r="0" b="0"/>
             <wp:docPr id="7" name="Picture 7"/>
@@ -2193,9 +1739,6 @@
       <w:pPr>
         <w:spacing w:after="280"/>
         <w:jc w:val="center"/>
-        <w:rPr>
-          <w:rFonts w:hint="eastAsia"/>
-        </w:rPr>
       </w:pPr>
       <w:r>
         <w:rPr>
@@ -2210,9 +1753,6 @@
       <w:pPr>
         <w:pStyle w:val="ListBullet"/>
         <w:spacing w:after="80"/>
-        <w:rPr>
-          <w:rFonts w:hint="eastAsia"/>
-        </w:rPr>
       </w:pPr>
       <w:r>
         <w:rPr>
@@ -2225,29 +1765,20 @@
         <w:rPr>
           <w:sz w:val="21"/>
         </w:rPr>
-        <w:t xml:space="preserve"> </w:t>
-      </w:r>
-      <w:r>
-        <w:rPr>
-          <w:sz w:val="21"/>
-        </w:rPr>
-        <w:t>จำนวนที่ดำเนินการทั้งหมด, อัตราอนุมัติ, อัตราปฏิเสธ, เวลาเฉลี่ยต่อฉบับ และจำนวนที่ผ่านระดับ MD</w:t>
+        <w:t xml:space="preserve"> จำนวนที่ดำเนินการทั้งหมด, อัตราอนุมัติ, อัตราปฏิเสธ, เวลาเฉลี่ยต่อฉบับ และจำนวนที่ผ่านระดับ MD</w:t>
       </w:r>
     </w:p>
     <w:p>
       <w:pPr>
         <w:pStyle w:val="ListBullet"/>
         <w:spacing w:after="80"/>
-        <w:rPr>
-          <w:rFonts w:hint="eastAsia"/>
-        </w:rPr>
       </w:pPr>
       <w:r>
         <w:rPr>
           <w:b/>
           <w:sz w:val="21"/>
         </w:rPr>
-        <w:t>ตัวกรอง Range และ Actor —</w:t>
+        <w:t>คลิกที่การ์ดหรือกราฟเพื่อกรอง —</w:t>
       </w:r>
       <w:r>
         <w:rPr>
@@ -2259,50 +1790,57 @@
         <w:rPr>
           <w:sz w:val="21"/>
         </w:rPr>
-        <w:t>เลือกดูเฉพาะช่วงเวลาที่สนใจ หรือดูเฉพาะรายการที่ผู้อนุมัติคนใดคนหนึ่งเป็นผู้ดำเนินการ</w:t>
+        <w:t>การ์ดตัวเลข 5 ช่องด้านบน และกราฟ “Action breakdown” / “By tier” ทางขวา คลิกได้ทันทีเพื่อกรองรายการด้านล่าง ตามที่เลือก คลิกซ้ำ</w:t>
+      </w:r>
+      <w:r>
+        <w:rPr>
+          <w:sz w:val="21"/>
+        </w:rPr>
+        <w:t>เพื่อยกเลิกตัวกรอง สถานะ Draft และ Pending ดูได้จากกราฟ Action breakdown เท่านั้น ไม่มีแท็บแยกไว้ด้านบน</w:t>
       </w:r>
     </w:p>
     <w:p>
       <w:pPr>
         <w:pStyle w:val="ListBullet"/>
         <w:spacing w:after="80"/>
-        <w:rPr>
-          <w:rFonts w:hint="eastAsia"/>
-        </w:rPr>
       </w:pPr>
       <w:r>
         <w:rPr>
           <w:b/>
           <w:sz w:val="21"/>
         </w:rPr>
-        <w:t>ปุ่ม Export CSV —</w:t>
+        <w:t>ตัวกรอง Range และ Actor —</w:t>
       </w:r>
       <w:r>
         <w:rPr>
           <w:sz w:val="21"/>
         </w:rPr>
-        <w:t xml:space="preserve"> </w:t>
-      </w:r>
-      <w:r>
-        <w:rPr>
-          <w:sz w:val="21"/>
-        </w:rPr>
-        <w:t>ดาวน์โหลดข้อมูลออกไปทำรายงานต่</w:t>
-      </w:r>
-      <w:r>
-        <w:rPr>
-          <w:sz w:val="21"/>
-        </w:rPr>
-        <w:t>อได้ทันที</w:t>
+        <w:t xml:space="preserve"> เลือกดูเฉพาะช่วงเวลาที่สนใจ หรือดูเฉพาะรายการที่ผู้อนุมัติคนใดคนหนึ่งเป็นผู้ดำเนินการ</w:t>
       </w:r>
     </w:p>
     <w:p>
       <w:pPr>
+        <w:pStyle w:val="ListBullet"/>
+        <w:spacing w:after="80"/>
+      </w:pPr>
+      <w:r>
+        <w:rPr>
+          <w:b/>
+          <w:sz w:val="21"/>
+        </w:rPr>
+        <w:t>ปุ่ม Export CSV —</w:t>
+      </w:r>
+      <w:r>
+        <w:rPr>
+          <w:sz w:val="21"/>
+        </w:rPr>
+        <w:t xml:space="preserve"> ดาวน์โหลดข้อมูลออกไปทำรายงานต่อได้ทันที</w:t>
+      </w:r>
+    </w:p>
+    <w:p>
+      <w:pPr>
         <w:keepNext/>
         <w:pageBreakBefore/>
-        <w:rPr>
-          <w:rFonts w:hint="eastAsia"/>
-        </w:rPr>
       </w:pPr>
       <w:r>
         <w:rPr>
@@ -2311,23 +1849,12 @@
           <w:sz w:val="40"/>
         </w:rPr>
         <w:lastRenderedPageBreak/>
-        <w:t xml:space="preserve">7. </w:t>
-      </w:r>
-      <w:r>
-        <w:rPr>
-          <w:b/>
-          <w:color w:val="0B142C"/>
-          <w:sz w:val="40"/>
-        </w:rPr>
-        <w:t>การแจ้งเตือนและ Telegram</w:t>
+        <w:t>7. การแจ้งเตือนและ Telegram</w:t>
       </w:r>
     </w:p>
     <w:p>
       <w:pPr>
         <w:spacing w:after="120"/>
-        <w:rPr>
-          <w:rFonts w:hint="eastAsia"/>
-        </w:rPr>
       </w:pPr>
       <w:r>
         <w:t>ระบบแจ้งเตือนคุณผ่านสองช่องทางพร้อมกัน เพื่อให้มั่นใจว่าจะไม่พลาดเอกสารที่ต้องดำเนินการ</w:t>
@@ -2336,16 +1863,13 @@
     <w:p>
       <w:pPr>
         <w:jc w:val="center"/>
-        <w:rPr>
-          <w:rFonts w:hint="eastAsia"/>
-        </w:rPr>
       </w:pPr>
       <w:r>
         <w:rPr>
           <w:noProof/>
         </w:rPr>
         <w:drawing>
-          <wp:inline distT="0" distB="0" distL="0" distR="0" wp14:anchorId="5ED26336" wp14:editId="4834EF46">
+          <wp:inline distT="0" distB="0" distL="0" distR="0" wp14:anchorId="3A5A3BF6" wp14:editId="32BB29E1">
             <wp:extent cx="5760720" cy="3600450"/>
             <wp:effectExtent l="0" t="0" r="0" b="0"/>
             <wp:docPr id="8" name="Picture 8"/>
@@ -2386,25 +1910,122 @@
         <w:spacing w:after="280"/>
         <w:jc w:val="center"/>
         <w:rPr>
-          <w:rFonts w:hint="eastAsia"/>
-        </w:rPr>
-      </w:pPr>
-      <w:r>
-        <w:rPr>
           <w:i/>
           <w:color w:val="64748B"/>
           <w:sz w:val="19"/>
         </w:rPr>
+      </w:pPr>
+      <w:r>
+        <w:rPr>
+          <w:i/>
+          <w:color w:val="64748B"/>
+          <w:sz w:val="19"/>
+        </w:rPr>
         <w:t>ภาพหน้าจอจริง — กระดิ่งแจ้งเตือนในระบบ แสดงรายการล่าสุด</w:t>
       </w:r>
     </w:p>
     <w:p>
       <w:pPr>
+        <w:spacing w:after="280"/>
+        <w:jc w:val="center"/>
+      </w:pPr>
+      <w:r>
+        <w:rPr>
+          <w:noProof/>
+        </w:rPr>
+        <w:drawing>
+          <wp:inline distT="0" distB="0" distL="0" distR="0" wp14:anchorId="51426A97" wp14:editId="7BFFF220">
+            <wp:extent cx="6188710" cy="1398905"/>
+            <wp:effectExtent l="0" t="0" r="2540" b="0"/>
+            <wp:docPr id="10" name="Picture 10"/>
+            <wp:cNvGraphicFramePr>
+              <a:graphicFrameLocks xmlns:a="http://schemas.openxmlformats.org/drawingml/2006/main" noChangeAspect="1"/>
+            </wp:cNvGraphicFramePr>
+            <a:graphic xmlns:a="http://schemas.openxmlformats.org/drawingml/2006/main">
+              <a:graphicData uri="http://schemas.openxmlformats.org/drawingml/2006/picture">
+                <pic:pic xmlns:pic="http://schemas.openxmlformats.org/drawingml/2006/picture">
+                  <pic:nvPicPr>
+                    <pic:cNvPr id="1" name=""/>
+                    <pic:cNvPicPr/>
+                  </pic:nvPicPr>
+                  <pic:blipFill>
+                    <a:blip r:embed="rId14"/>
+                    <a:stretch>
+                      <a:fillRect/>
+                    </a:stretch>
+                  </pic:blipFill>
+                  <pic:spPr>
+                    <a:xfrm>
+                      <a:off x="0" y="0"/>
+                      <a:ext cx="6188710" cy="1398905"/>
+                    </a:xfrm>
+                    <a:prstGeom prst="rect">
+                      <a:avLst/>
+                    </a:prstGeom>
+                  </pic:spPr>
+                </pic:pic>
+              </a:graphicData>
+            </a:graphic>
+          </wp:inline>
+        </w:drawing>
+      </w:r>
+    </w:p>
+    <w:p>
+      <w:pPr>
+        <w:spacing w:after="280"/>
+        <w:jc w:val="center"/>
+        <w:rPr>
+          <w:iCs/>
+          <w:color w:val="64748B"/>
+          <w:sz w:val="19"/>
+          <w:lang w:bidi="th-TH"/>
+        </w:rPr>
+      </w:pPr>
+      <w:r>
+        <w:rPr>
+          <w:i/>
+          <w:color w:val="64748B"/>
+          <w:sz w:val="19"/>
+        </w:rPr>
+        <w:t xml:space="preserve">ภาพหน้าจอจริง — </w:t>
+      </w:r>
+      <w:r>
+        <w:rPr>
+          <w:rFonts w:hint="cs"/>
+          <w:iCs/>
+          <w:color w:val="64748B"/>
+          <w:sz w:val="19"/>
+          <w:szCs w:val="19"/>
+          <w:cs/>
+          <w:lang w:bidi="th-TH"/>
+        </w:rPr>
+        <w:t>แชทจากโปรแกรม</w:t>
+      </w:r>
+      <w:r>
+        <w:rPr>
+          <w:iCs/>
+          <w:color w:val="64748B"/>
+          <w:sz w:val="19"/>
+          <w:szCs w:val="19"/>
+          <w:lang w:bidi="th-TH"/>
+        </w:rPr>
+        <w:t xml:space="preserve"> </w:t>
+      </w:r>
+      <w:r>
+        <w:rPr>
+          <w:i/>
+          <w:color w:val="64748B"/>
+          <w:sz w:val="19"/>
+          <w:szCs w:val="19"/>
+          <w:lang w:bidi="th-TH"/>
+        </w:rPr>
+        <w:t>telegram</w:t>
+      </w:r>
+    </w:p>
+    <w:p>
+      <w:pPr>
         <w:pStyle w:val="ListBullet"/>
         <w:spacing w:after="80"/>
-        <w:rPr>
-          <w:rFonts w:hint="eastAsia"/>
-        </w:rPr>
       </w:pPr>
       <w:r>
         <w:rPr>
@@ -2417,28 +2038,13 @@
         <w:rPr>
           <w:sz w:val="21"/>
         </w:rPr>
-        <w:t xml:space="preserve"> </w:t>
-      </w:r>
-      <w:r>
-        <w:rPr>
-          <w:sz w:val="21"/>
-        </w:rPr>
-        <w:t>มุมขวาบนทุกหน้า จะมีจุดสีแดงขึ้นเมื่อมีแจ้งเตือ</w:t>
-      </w:r>
-      <w:r>
-        <w:rPr>
-          <w:sz w:val="21"/>
-        </w:rPr>
-        <w:t>นใหม่ คลิกเพื่อดูรายการ แล้วคลิกอีกครั้งที่รายการนั้นเพื่อไปยังเมโมที่เกี่ยวข้องได้โดยตรง</w:t>
+        <w:t xml:space="preserve"> มุมขวาบนทุกหน้า จะมีจุดสีแดงขึ้นเมื่อมีแจ้งเตือนใหม่ คลิกเพื่อดูรายการ แล้วคลิกอีกครั้งที่รายการนั้นเพื่อไปยังเมโมที่เกี่ยวข้องได้โดยตรง</w:t>
       </w:r>
     </w:p>
     <w:p>
       <w:pPr>
         <w:pStyle w:val="ListBullet"/>
         <w:spacing w:after="80"/>
-        <w:rPr>
-          <w:rFonts w:hint="eastAsia"/>
-        </w:rPr>
       </w:pPr>
       <w:r>
         <w:rPr>
@@ -2451,36 +2057,21 @@
         <w:rPr>
           <w:sz w:val="21"/>
         </w:rPr>
-        <w:t xml:space="preserve"> </w:t>
-      </w:r>
-      <w:r>
-        <w:rPr>
-          <w:sz w:val="21"/>
-        </w:rPr>
-        <w:t>ช่องทางเสริมที่ส่งแจ้งเตือนแบบ push ทันทีที่มีเอกสารรอคุณอนุมัติ พร้อมปุ่มกดอนุมัติ ตีกลับ หรือปฏิเสธได้เลยจากในแชท</w:t>
+        <w:t xml:space="preserve"> ช่องทางเสริมที่ส่งแจ้งเตือนแบบ push ทันทีที่มีเอกสารรอคุณอนุมัติ พร้อมปุ่มกดอนุมัติ ตีกลับ หรือปฏิเสธได้เลยจากในแชท</w:t>
       </w:r>
     </w:p>
     <w:p>
       <w:pPr>
         <w:spacing w:after="120"/>
-        <w:rPr>
-          <w:rFonts w:hint="eastAsia"/>
-        </w:rPr>
-      </w:pPr>
-      <w:r>
-        <w:t>วิธีผูกบัญชี Telegram: ไปที่หน้า "โปรไฟ</w:t>
-      </w:r>
-      <w:r>
-        <w:t>ล์ของฉัน" เลื่อนลงไปที่หัวข้อ Telegram แล้วทำตามลิงก์เพื่อเชื่อมต่อบัญชี ทำเพียงครั้งเดียวเท่านั้น</w:t>
+      </w:pPr>
+      <w:r>
+        <w:t>วิธีผูกบัญชี Telegram: ไปที่หน้า "โปรไฟล์ของฉัน" เลื่อนลงไปที่หัวข้อ Telegram แล้วทำตามลิงก์เพื่อเชื่อมต่อบัญชี ทำเพียงครั้งเดียวเท่านั้น</w:t>
       </w:r>
     </w:p>
     <w:p>
       <w:pPr>
         <w:keepNext/>
         <w:pageBreakBefore/>
-        <w:rPr>
-          <w:rFonts w:hint="eastAsia"/>
-        </w:rPr>
       </w:pPr>
       <w:r>
         <w:rPr>
@@ -2489,23 +2080,12 @@
           <w:sz w:val="40"/>
         </w:rPr>
         <w:lastRenderedPageBreak/>
-        <w:t xml:space="preserve">8. </w:t>
-      </w:r>
-      <w:r>
-        <w:rPr>
-          <w:b/>
-          <w:color w:val="0B142C"/>
-          <w:sz w:val="40"/>
-        </w:rPr>
-        <w:t>โปรไฟล์ของฉัน</w:t>
+        <w:t>8. โปรไฟล์ของฉัน</w:t>
       </w:r>
     </w:p>
     <w:p>
       <w:pPr>
         <w:spacing w:after="120"/>
-        <w:rPr>
-          <w:rFonts w:hint="eastAsia"/>
-        </w:rPr>
       </w:pPr>
       <w:r>
         <w:t>หน้านี้ให้คุณตรวจสอบข้อมูลบัญชี ดูสถานะการเข้าสู่ระบบ และผูกหรือยกเลิกการเชื่อมต่อ Telegram ได้ในที่เดียว</w:t>
@@ -2514,16 +2094,13 @@
     <w:p>
       <w:pPr>
         <w:jc w:val="center"/>
-        <w:rPr>
-          <w:rFonts w:hint="eastAsia"/>
-        </w:rPr>
       </w:pPr>
       <w:r>
         <w:rPr>
           <w:noProof/>
         </w:rPr>
         <w:drawing>
-          <wp:inline distT="0" distB="0" distL="0" distR="0" wp14:anchorId="31CC3669" wp14:editId="025015CB">
+          <wp:inline distT="0" distB="0" distL="0" distR="0" wp14:anchorId="24F8BC93" wp14:editId="75670C1F">
             <wp:extent cx="5760720" cy="3600450"/>
             <wp:effectExtent l="0" t="0" r="0" b="0"/>
             <wp:docPr id="9" name="Picture 9"/>
@@ -2538,7 +2115,7 @@
                     <pic:cNvPicPr/>
                   </pic:nvPicPr>
                   <pic:blipFill>
-                    <a:blip r:embed="rId14"/>
+                    <a:blip r:embed="rId15"/>
                     <a:stretch>
                       <a:fillRect/>
                     </a:stretch>
@@ -2563,9 +2140,6 @@
       <w:pPr>
         <w:spacing w:after="280"/>
         <w:jc w:val="center"/>
-        <w:rPr>
-          <w:rFonts w:hint="eastAsia"/>
-        </w:rPr>
       </w:pPr>
       <w:r>
         <w:rPr>
@@ -2573,24 +2147,13 @@
           <w:color w:val="64748B"/>
           <w:sz w:val="19"/>
         </w:rPr>
-        <w:t>ภาพหน้าจอจริง — หน้าโปรไฟล์ผู้ใช</w:t>
-      </w:r>
-      <w:r>
-        <w:rPr>
-          <w:i/>
-          <w:color w:val="64748B"/>
-          <w:sz w:val="19"/>
-        </w:rPr>
-        <w:t>้</w:t>
+        <w:t>ภาพหน้าจอจริง — หน้าโปรไฟล์ผู้ใช้</w:t>
       </w:r>
     </w:p>
     <w:p>
       <w:pPr>
         <w:pStyle w:val="ListBullet"/>
         <w:spacing w:after="80"/>
-        <w:rPr>
-          <w:rFonts w:hint="eastAsia"/>
-        </w:rPr>
       </w:pPr>
       <w:r>
         <w:rPr>
@@ -2603,22 +2166,13 @@
         <w:rPr>
           <w:sz w:val="21"/>
         </w:rPr>
-        <w:t xml:space="preserve"> </w:t>
-      </w:r>
-      <w:r>
-        <w:rPr>
-          <w:sz w:val="21"/>
-        </w:rPr>
-        <w:t>ชื่อ-นามสกุล รหัสบัตรพนักงาน อีเมล และแผนกของคุณ แก้ไขเองในหน้านี้ไม่ได้ หากข้อมูลไม่ถูกต้อง ให้ติดต่อแอดมิน</w:t>
+        <w:t xml:space="preserve"> ชื่อ-นามสกุล รหัสบัตรพนักงาน อีเมล และแผนกของคุณ แก้ไขเองในหน้านี้ไม่ได้ หากข้อมูลไม่ถูกต้อง ให้ติดต่อแอดมิน</w:t>
       </w:r>
     </w:p>
     <w:p>
       <w:pPr>
         <w:pStyle w:val="ListBullet"/>
         <w:spacing w:after="80"/>
-        <w:rPr>
-          <w:rFonts w:hint="eastAsia"/>
-        </w:rPr>
       </w:pPr>
       <w:r>
         <w:rPr>
@@ -2631,22 +2185,13 @@
         <w:rPr>
           <w:sz w:val="21"/>
         </w:rPr>
-        <w:t xml:space="preserve"> </w:t>
-      </w:r>
-      <w:r>
-        <w:rPr>
-          <w:sz w:val="21"/>
-        </w:rPr>
-        <w:t>แต่ละครั้งที่เข้าสู่ระบบ ระบบจะให้คุณใช้งานได้ต่อเนื่อง 8 ชั่วโมง หลังจากนั้นต้องเข้าสู่ระบบใหม่</w:t>
+        <w:t xml:space="preserve"> แต่ละครั้งที่เข้าสู่ระบบ ระบบจะให้คุณใช้งานได้ต่อเนื่อง 8 ชั่วโมง หลังจากนั้นต้องเข้าสู่ระบบใหม่</w:t>
       </w:r>
     </w:p>
     <w:p>
       <w:pPr>
         <w:pStyle w:val="ListBullet"/>
         <w:spacing w:after="80"/>
-        <w:rPr>
-          <w:rFonts w:hint="eastAsia"/>
-        </w:rPr>
       </w:pPr>
       <w:r>
         <w:rPr>
@@ -2659,44 +2204,39 @@
         <w:rPr>
           <w:sz w:val="21"/>
         </w:rPr>
-        <w:t xml:space="preserve"> </w:t>
-      </w:r>
-      <w:r>
-        <w:rPr>
-          <w:sz w:val="21"/>
-        </w:rPr>
-        <w:t>พบปัญหาระหว่างใช้งาน กดปุ่มนี้เพื่อแจ้งตรงถึงผู้ดูแลระบบได้ทันที</w:t>
+        <w:t xml:space="preserve"> พบปัญหาระหว่างใช้งาน กดปุ่มนี้เพื่อแจ้งตรงถึงผู้ดูแลระบบได้ทันที</w:t>
       </w:r>
     </w:p>
     <w:p>
       <w:pPr>
         <w:spacing w:after="120"/>
-        <w:rPr>
-          <w:rFonts w:hint="eastAsia"/>
-        </w:rPr>
       </w:pPr>
     </w:p>
     <w:p>
       <w:pPr>
         <w:spacing w:before="600" w:after="120"/>
         <w:jc w:val="center"/>
-        <w:rPr>
-          <w:rFonts w:hint="eastAsia"/>
-        </w:rPr>
       </w:pPr>
       <w:r>
         <w:rPr>
           <w:color w:val="64748B"/>
           <w:sz w:val="18"/>
         </w:rPr>
-        <w:t>คู่มือฉบับนี้จัดทำโดยทีม IT Ranger · Complete Auto Rubber Manufacturing</w:t>
+        <w:t xml:space="preserve">คู่มือฉบับนี้จัดทำโดย </w:t>
       </w:r>
       <w:r>
         <w:rPr>
           <w:color w:val="64748B"/>
           <w:sz w:val="18"/>
         </w:rPr>
-        <w:t xml:space="preserve"> Co., Ltd. · HR&amp;GA Workflow System</w:t>
+        <w:t>punnawich</w:t>
+      </w:r>
+      <w:r>
+        <w:rPr>
+          <w:color w:val="64748B"/>
+          <w:sz w:val="18"/>
+        </w:rPr>
+        <w:t xml:space="preserve"> · Complete Auto Rubber Manufacturing Co., Ltd. · HR&amp;GA Workflow System</w:t>
       </w:r>
     </w:p>
     <w:sectPr>
@@ -3197,11 +2737,6 @@
     <w:lsdException w:name="Book Title" w:uiPriority="33" w:qFormat="1"/>
     <w:lsdException w:name="Bibliography" w:semiHidden="1" w:uiPriority="37" w:unhideWhenUsed="1"/>
     <w:lsdException w:name="TOC Heading" w:semiHidden="1" w:uiPriority="39" w:unhideWhenUsed="1" w:qFormat="1"/>
-    <w:lsdException w:name="Plain Table 5" w:semiHidden="1" w:unhideWhenUsed="1"/>
-    <w:lsdException w:name="Grid Table Light" w:semiHidden="1" w:unhideWhenUsed="1"/>
-    <w:lsdException w:name="Grid Table 1 Light" w:semiHidden="1" w:unhideWhenUsed="1"/>
-    <w:lsdException w:name="Grid Table 2" w:semiHidden="1" w:unhideWhenUsed="1"/>
-    <w:lsdException w:name="Grid Table 3" w:semiHidden="1" w:unhideWhenUsed="1"/>
     <w:lsdException w:name="Grid Table 4" w:uiPriority="49"/>
     <w:lsdException w:name="Grid Table 5 Dark" w:uiPriority="50"/>
     <w:lsdException w:name="Grid Table 6 Colorful" w:uiPriority="51"/>

</xml_diff>